<commit_message>
fix: corregir DAS.docx desactualizado en docs/
</commit_message>
<xml_diff>
--- a/docs/DAS.docx
+++ b/docs/DAS.docx
@@ -103,6 +103,182 @@
           <w:szCs w:val="24"/>
         </w:rPr>
         <w:t xml:space="preserve">Repositorio: alerta-temprana-deslizamientos</w:t>
+      </w:r>
+    </w:p>
+    <w:p>
+      <w:r>
+        <w:br w:type="page"/>
+      </w:r>
+    </w:p>
+    <w:p>
+      <w:pPr>
+        <w:pStyle w:val="Heading1"/>
+        <w:spacing w:after="150" w:before="300"/>
+      </w:pPr>
+      <w:r>
+        <w:t xml:space="preserve">0. Enunciado del Caso 7 (texto original)</w:t>
+      </w:r>
+    </w:p>
+    <w:p>
+      <w:pPr>
+        <w:pStyle w:val="Heading2"/>
+        <w:spacing w:after="120" w:before="250"/>
+      </w:pPr>
+      <w:r>
+        <w:t xml:space="preserve">Contexto del caso</w:t>
+      </w:r>
+    </w:p>
+    <w:p>
+      <w:pPr>
+        <w:spacing w:after="160" w:line="276"/>
+        <w:jc w:val="both"/>
+      </w:pPr>
+      <w:r>
+        <w:rPr>
+          <w:rFonts w:ascii="Arial" w:cs="Arial" w:eastAsia="Arial" w:hAnsi="Arial"/>
+          <w:b w:val="false"/>
+          <w:bCs w:val="false"/>
+          <w:i w:val="false"/>
+          <w:iCs w:val="false"/>
+          <w:sz w:val="24"/>
+          <w:szCs w:val="24"/>
+        </w:rPr>
+        <w:t xml:space="preserve">Una red de 8 sensores de humedad instalados en zona de ladera reporta datos por lotes cada hora, vía SMS, a un celular que un técnico revisa manualmente. No hay presupuesto para reemplazar los sensores.</w:t>
+      </w:r>
+    </w:p>
+    <w:p>
+      <w:pPr>
+        <w:pStyle w:val="Heading2"/>
+        <w:spacing w:after="120" w:before="250"/>
+      </w:pPr>
+      <w:r>
+        <w:t xml:space="preserve">Palabras del cliente</w:t>
+      </w:r>
+    </w:p>
+    <w:p>
+      <w:pPr>
+        <w:spacing w:after="160" w:line="276"/>
+        <w:jc w:val="both"/>
+      </w:pPr>
+      <w:r>
+        <w:rPr>
+          <w:rFonts w:ascii="Arial" w:cs="Arial" w:eastAsia="Arial" w:hAnsi="Arial"/>
+          <w:b w:val="false"/>
+          <w:bCs w:val="false"/>
+          <w:i/>
+          <w:iCs/>
+          <w:sz w:val="24"/>
+          <w:szCs w:val="24"/>
+        </w:rPr>
+        <w:t xml:space="preserve">“El deslizamiento de la vereda El Roble ocurrió a las 3 de la madrugada. El reporte del sensor llegó a las 4am, cuando el técnico finalmente lo revisó. Para entonces ya era tarde.”</w:t>
+      </w:r>
+    </w:p>
+    <w:p>
+      <w:pPr>
+        <w:pStyle w:val="Heading2"/>
+        <w:spacing w:after="120" w:before="250"/>
+      </w:pPr>
+      <w:r>
+        <w:t xml:space="preserve">Datos del caso</w:t>
+      </w:r>
+    </w:p>
+    <w:p>
+      <w:pPr>
+        <w:spacing w:after="160" w:line="276"/>
+        <w:jc w:val="both"/>
+      </w:pPr>
+      <w:r>
+        <w:rPr>
+          <w:rFonts w:ascii="Arial" w:cs="Arial" w:eastAsia="Arial" w:hAnsi="Arial"/>
+          <w:b w:val="false"/>
+          <w:bCs w:val="false"/>
+          <w:i w:val="false"/>
+          <w:iCs w:val="false"/>
+          <w:sz w:val="24"/>
+          <w:szCs w:val="24"/>
+        </w:rPr>
+        <w:t xml:space="preserve">Infraestructura fija: 8 sensores existentes, no reemplazables por restricción de presupuesto.</w:t>
+      </w:r>
+    </w:p>
+    <w:p>
+      <w:pPr>
+        <w:spacing w:after="160" w:line="276"/>
+        <w:jc w:val="both"/>
+      </w:pPr>
+      <w:r>
+        <w:rPr>
+          <w:rFonts w:ascii="Arial" w:cs="Arial" w:eastAsia="Arial" w:hAnsi="Arial"/>
+          <w:b w:val="false"/>
+          <w:bCs w:val="false"/>
+          <w:i w:val="false"/>
+          <w:iCs w:val="false"/>
+          <w:sz w:val="24"/>
+          <w:szCs w:val="24"/>
+        </w:rPr>
+        <w:t xml:space="preserve">Frecuencia actual: reporte por lotes cada hora, revisión manual.</w:t>
+      </w:r>
+    </w:p>
+    <w:p>
+      <w:pPr>
+        <w:spacing w:after="160" w:line="276"/>
+        <w:jc w:val="both"/>
+      </w:pPr>
+      <w:r>
+        <w:rPr>
+          <w:rFonts w:ascii="Arial" w:cs="Arial" w:eastAsia="Arial" w:hAnsi="Arial"/>
+          <w:b w:val="false"/>
+          <w:bCs w:val="false"/>
+          <w:i w:val="false"/>
+          <w:iCs w:val="false"/>
+          <w:sz w:val="24"/>
+          <w:szCs w:val="24"/>
+        </w:rPr>
+        <w:t xml:space="preserve">Atributo de calidad crítico: disponibilidad y tiempo de respuesta (una alerta tardía no sirve).</w:t>
+      </w:r>
+    </w:p>
+    <w:p>
+      <w:pPr>
+        <w:spacing w:after="160" w:line="276"/>
+        <w:jc w:val="both"/>
+      </w:pPr>
+      <w:r>
+        <w:rPr>
+          <w:rFonts w:ascii="Arial" w:cs="Arial" w:eastAsia="Arial" w:hAnsi="Arial"/>
+          <w:b w:val="false"/>
+          <w:bCs w:val="false"/>
+          <w:i w:val="false"/>
+          <w:iCs w:val="false"/>
+          <w:sz w:val="24"/>
+          <w:szCs w:val="24"/>
+        </w:rPr>
+        <w:t xml:space="preserve">Restricción técnica dura: no se puede cambiar el hardware de los sensores, solo el procesamiento de los datos que ya envían.</w:t>
+      </w:r>
+    </w:p>
+    <w:p>
+      <w:pPr>
+        <w:pStyle w:val="Heading2"/>
+        <w:spacing w:after="120" w:before="250"/>
+      </w:pPr>
+      <w:r>
+        <w:t xml:space="preserve">Reto para el arquitecto</w:t>
+      </w:r>
+    </w:p>
+    <w:p>
+      <w:pPr>
+        <w:spacing w:after="160" w:line="276"/>
+        <w:jc w:val="both"/>
+      </w:pPr>
+      <w:r>
+        <w:rPr>
+          <w:rFonts w:ascii="Arial" w:cs="Arial" w:eastAsia="Arial" w:hAnsi="Arial"/>
+          <w:b w:val="false"/>
+          <w:bCs w:val="false"/>
+          <w:i w:val="false"/>
+          <w:iCs w:val="false"/>
+          <w:sz w:val="24"/>
+          <w:szCs w:val="24"/>
+        </w:rPr>
+        <w:t xml:space="preserve">Diseñar cómo procesar y alertar sobre los datos que ya emiten los sensores existentes de forma casi inmediata, sin poder modificar el hardware, priorizando disponibilidad y tiempo de respuesta por encima de cualquier otro atributo.</w:t>
       </w:r>
     </w:p>
     <w:p>

</xml_diff>

<commit_message>
docs: agregar Sección 2 (patrón N-Capas y pila tecnológica) al DAS v0.2
</commit_message>
<xml_diff>
--- a/docs/DAS.docx
+++ b/docs/DAS.docx
@@ -88,7 +88,7 @@
           <w:sz w:val="24"/>
           <w:szCs w:val="24"/>
         </w:rPr>
-        <w:t xml:space="preserve">Versión del documento: 0.1 — Fecha: 26/09/2026</w:t>
+        <w:t xml:space="preserve">Versión del documento: 0.2 — Fecha: 14/10/2026</w:t>
       </w:r>
     </w:p>
     <w:p>
@@ -4399,6 +4399,1259 @@
         </w:tc>
       </w:tr>
     </w:tbl>
+    <w:p>
+      <w:r>
+        <w:br w:type="page"/>
+      </w:r>
+    </w:p>
+    <w:p>
+      <w:pPr>
+        <w:pStyle w:val="Heading1"/>
+        <w:spacing w:after="150" w:before="300"/>
+      </w:pPr>
+      <w:r>
+        <w:t xml:space="preserve">Sección 2: Estrategia Arquitectónica y Tecnológica</w:t>
+      </w:r>
+    </w:p>
+    <w:p>
+      <w:pPr>
+        <w:pStyle w:val="Heading2"/>
+        <w:spacing w:after="120" w:before="250"/>
+      </w:pPr>
+      <w:r>
+        <w:t xml:space="preserve">2.1 Patrón arquitectónico principal</w:t>
+      </w:r>
+    </w:p>
+    <w:p>
+      <w:pPr>
+        <w:spacing w:after="160" w:line="276"/>
+        <w:jc w:val="both"/>
+      </w:pPr>
+      <w:r>
+        <w:rPr>
+          <w:rFonts w:ascii="Arial" w:cs="Arial" w:eastAsia="Arial" w:hAnsi="Arial"/>
+          <w:b/>
+          <w:bCs/>
+          <w:sz w:val="24"/>
+          <w:szCs w:val="24"/>
+        </w:rPr>
+        <w:t xml:space="preserve">Patrón seleccionado: </w:t>
+      </w:r>
+      <w:r>
+        <w:rPr>
+          <w:rFonts w:ascii="Arial" w:cs="Arial" w:eastAsia="Arial" w:hAnsi="Arial"/>
+          <w:sz w:val="24"/>
+          <w:szCs w:val="24"/>
+        </w:rPr>
+        <w:t xml:space="preserve">N-Capas (presentación, negocio y datos).</w:t>
+      </w:r>
+    </w:p>
+    <w:p>
+      <w:pPr>
+        <w:spacing w:after="160" w:line="276"/>
+        <w:jc w:val="both"/>
+      </w:pPr>
+      <w:r>
+        <w:rPr>
+          <w:rFonts w:ascii="Arial" w:cs="Arial" w:eastAsia="Arial" w:hAnsi="Arial"/>
+          <w:b/>
+          <w:bCs/>
+          <w:sz w:val="24"/>
+          <w:szCs w:val="24"/>
+        </w:rPr>
+        <w:t xml:space="preserve">Justificación: </w:t>
+      </w:r>
+      <w:r>
+        <w:rPr>
+          <w:rFonts w:ascii="Arial" w:cs="Arial" w:eastAsia="Arial" w:hAnsi="Arial"/>
+          <w:sz w:val="24"/>
+          <w:szCs w:val="24"/>
+        </w:rPr>
+        <w:t xml:space="preserve">Se selecciona el patrón N-Capas (presentación, negocio y datos) porque el atributo prioritario Mantenibilidad (AC-07) exige que ajustar un umbral o la regla de tendencia afecte máximo 1-2 archivos de configuración, sin tocar el módulo de recepción de SMS ni el esquema de la base de datos; la separación en capas concentra las reglas en una sola capa de negocio, aislada de la entrada y de la persistencia. Esa misma capa expone los canales de notificación detrás de una interfaz común con al menos dos implementaciones independientes, lo que sostiene la Confiabilidad (AC-05): si un canal falla, el otro entrega la alerta. Al desplegarse el backend como una sola aplicación, la lectura se procesa dentro del mismo proceso, sin saltos de red internos, lo que favorece la Eficiencia de desempeño (AC-02, ≤ 5 s). Se descarta la Arquitectura Hexagonal porque su estructura adicional contradice la restricción de tiempo (sección 1.4) de un proyecto individual con un solo desarrollador, y se descartan Microservicios y la arquitectura orientada a eventos con broker porque su costo operativo contradice la restricción de presupuesto (RA-02) y añade puntos de falla frente a la Confiabilidad (AC-05).</w:t>
+      </w:r>
+    </w:p>
+    <w:p>
+      <w:pPr>
+        <w:pStyle w:val="Heading2"/>
+        <w:spacing w:after="120" w:before="250"/>
+      </w:pPr>
+      <w:r>
+        <w:t xml:space="preserve">2.2 Pila tecnológica</w:t>
+      </w:r>
+    </w:p>
+    <w:p>
+      <w:pPr>
+        <w:spacing w:after="160" w:line="276"/>
+        <w:jc w:val="both"/>
+      </w:pPr>
+      <w:r>
+        <w:rPr>
+          <w:rFonts w:ascii="Arial" w:cs="Arial" w:eastAsia="Arial" w:hAnsi="Arial"/>
+          <w:sz w:val="24"/>
+          <w:szCs w:val="24"/>
+        </w:rPr>
+        <w:t xml:space="preserve">Cada tecnología se conecta con un atributo de calidad prioritario (sección 1.3) o con una restricción (sección 1.4), y se indica la alternativa descartada.</w:t>
+      </w:r>
+    </w:p>
+    <w:tbl>
+      <w:tblPr>
+        <w:tblW w:type="dxa" w:w="9000"/>
+        <w:tblBorders>
+          <w:top w:val="single" w:color="auto" w:sz="4"/>
+          <w:left w:val="single" w:color="auto" w:sz="4"/>
+          <w:bottom w:val="single" w:color="auto" w:sz="4"/>
+          <w:right w:val="single" w:color="auto" w:sz="4"/>
+          <w:insideH w:val="single" w:color="auto" w:sz="4"/>
+          <w:insideV w:val="single" w:color="auto" w:sz="4"/>
+        </w:tblBorders>
+      </w:tblPr>
+      <w:tblGrid>
+        <w:gridCol w:w="1700"/>
+        <w:gridCol w:w="2000"/>
+        <w:gridCol w:w="1500"/>
+        <w:gridCol w:w="3800"/>
+      </w:tblGrid>
+      <w:tr>
+        <w:trPr>
+          <w:tblHeader/>
+        </w:trPr>
+        <w:tc>
+          <w:tcPr>
+            <w:tcW w:type="dxa" w:w="1700"/>
+            <w:shd w:fill="1F4E79" w:val="clear"/>
+            <w:tcMar>
+              <w:top w:type="dxa" w:w="80"/>
+              <w:left w:type="dxa" w:w="100"/>
+              <w:bottom w:type="dxa" w:w="80"/>
+              <w:right w:type="dxa" w:w="100"/>
+            </w:tcMar>
+            <w:vAlign w:val="center"/>
+          </w:tcPr>
+          <w:p>
+            <w:r>
+              <w:rPr>
+                <w:rFonts w:ascii="Arial" w:cs="Arial" w:eastAsia="Arial" w:hAnsi="Arial"/>
+                <w:b/>
+                <w:bCs/>
+                <w:color w:val="FFFFFF"/>
+                <w:sz w:val="20"/>
+                <w:szCs w:val="20"/>
+              </w:rPr>
+              <w:t xml:space="preserve">Capa</w:t>
+            </w:r>
+          </w:p>
+        </w:tc>
+        <w:tc>
+          <w:tcPr>
+            <w:tcW w:type="dxa" w:w="2000"/>
+            <w:shd w:fill="1F4E79" w:val="clear"/>
+            <w:tcMar>
+              <w:top w:type="dxa" w:w="80"/>
+              <w:left w:type="dxa" w:w="100"/>
+              <w:bottom w:type="dxa" w:w="80"/>
+              <w:right w:type="dxa" w:w="100"/>
+            </w:tcMar>
+            <w:vAlign w:val="center"/>
+          </w:tcPr>
+          <w:p>
+            <w:r>
+              <w:rPr>
+                <w:rFonts w:ascii="Arial" w:cs="Arial" w:eastAsia="Arial" w:hAnsi="Arial"/>
+                <w:b/>
+                <w:bCs/>
+                <w:color w:val="FFFFFF"/>
+                <w:sz w:val="20"/>
+                <w:szCs w:val="20"/>
+              </w:rPr>
+              <w:t xml:space="preserve">Tecnología elegida</w:t>
+            </w:r>
+          </w:p>
+        </w:tc>
+        <w:tc>
+          <w:tcPr>
+            <w:tcW w:type="dxa" w:w="1500"/>
+            <w:shd w:fill="1F4E79" w:val="clear"/>
+            <w:tcMar>
+              <w:top w:type="dxa" w:w="80"/>
+              <w:left w:type="dxa" w:w="100"/>
+              <w:bottom w:type="dxa" w:w="80"/>
+              <w:right w:type="dxa" w:w="100"/>
+            </w:tcMar>
+            <w:vAlign w:val="center"/>
+          </w:tcPr>
+          <w:p>
+            <w:r>
+              <w:rPr>
+                <w:rFonts w:ascii="Arial" w:cs="Arial" w:eastAsia="Arial" w:hAnsi="Arial"/>
+                <w:b/>
+                <w:bCs/>
+                <w:color w:val="FFFFFF"/>
+                <w:sz w:val="20"/>
+                <w:szCs w:val="20"/>
+              </w:rPr>
+              <w:t xml:space="preserve">Alternativa descartada</w:t>
+            </w:r>
+          </w:p>
+        </w:tc>
+        <w:tc>
+          <w:tcPr>
+            <w:tcW w:type="dxa" w:w="3800"/>
+            <w:shd w:fill="1F4E79" w:val="clear"/>
+            <w:tcMar>
+              <w:top w:type="dxa" w:w="80"/>
+              <w:left w:type="dxa" w:w="100"/>
+              <w:bottom w:type="dxa" w:w="80"/>
+              <w:right w:type="dxa" w:w="100"/>
+            </w:tcMar>
+            <w:vAlign w:val="center"/>
+          </w:tcPr>
+          <w:p>
+            <w:r>
+              <w:rPr>
+                <w:rFonts w:ascii="Arial" w:cs="Arial" w:eastAsia="Arial" w:hAnsi="Arial"/>
+                <w:b/>
+                <w:bCs/>
+                <w:color w:val="FFFFFF"/>
+                <w:sz w:val="20"/>
+                <w:szCs w:val="20"/>
+              </w:rPr>
+              <w:t xml:space="preserve">Justificación</w:t>
+            </w:r>
+          </w:p>
+        </w:tc>
+      </w:tr>
+      <w:tr>
+        <w:trPr>
+          <w:cantSplit/>
+        </w:trPr>
+        <w:tc>
+          <w:tcPr>
+            <w:tcW w:type="dxa" w:w="1700"/>
+            <w:tcMar>
+              <w:top w:type="dxa" w:w="80"/>
+              <w:left w:type="dxa" w:w="100"/>
+              <w:bottom w:type="dxa" w:w="80"/>
+              <w:right w:type="dxa" w:w="100"/>
+            </w:tcMar>
+            <w:vAlign w:val="center"/>
+          </w:tcPr>
+          <w:p>
+            <w:r>
+              <w:rPr>
+                <w:rFonts w:ascii="Arial" w:cs="Arial" w:eastAsia="Arial" w:hAnsi="Arial"/>
+                <w:b w:val="false"/>
+                <w:bCs w:val="false"/>
+                <w:sz w:val="20"/>
+                <w:szCs w:val="20"/>
+              </w:rPr>
+              <w:t xml:space="preserve">Lenguaje backend</w:t>
+            </w:r>
+          </w:p>
+        </w:tc>
+        <w:tc>
+          <w:tcPr>
+            <w:tcW w:type="dxa" w:w="2000"/>
+            <w:tcMar>
+              <w:top w:type="dxa" w:w="80"/>
+              <w:left w:type="dxa" w:w="100"/>
+              <w:bottom w:type="dxa" w:w="80"/>
+              <w:right w:type="dxa" w:w="100"/>
+            </w:tcMar>
+            <w:vAlign w:val="center"/>
+          </w:tcPr>
+          <w:p>
+            <w:r>
+              <w:rPr>
+                <w:rFonts w:ascii="Arial" w:cs="Arial" w:eastAsia="Arial" w:hAnsi="Arial"/>
+                <w:b w:val="false"/>
+                <w:bCs w:val="false"/>
+                <w:sz w:val="20"/>
+                <w:szCs w:val="20"/>
+              </w:rPr>
+              <w:t xml:space="preserve">Java</w:t>
+            </w:r>
+          </w:p>
+        </w:tc>
+        <w:tc>
+          <w:tcPr>
+            <w:tcW w:type="dxa" w:w="1500"/>
+            <w:tcMar>
+              <w:top w:type="dxa" w:w="80"/>
+              <w:left w:type="dxa" w:w="100"/>
+              <w:bottom w:type="dxa" w:w="80"/>
+              <w:right w:type="dxa" w:w="100"/>
+            </w:tcMar>
+            <w:vAlign w:val="center"/>
+          </w:tcPr>
+          <w:p>
+            <w:r>
+              <w:rPr>
+                <w:rFonts w:ascii="Arial" w:cs="Arial" w:eastAsia="Arial" w:hAnsi="Arial"/>
+                <w:b w:val="false"/>
+                <w:bCs w:val="false"/>
+                <w:sz w:val="20"/>
+                <w:szCs w:val="20"/>
+              </w:rPr>
+              <w:t xml:space="preserve">Python</w:t>
+            </w:r>
+          </w:p>
+        </w:tc>
+        <w:tc>
+          <w:tcPr>
+            <w:tcW w:type="dxa" w:w="3800"/>
+            <w:tcMar>
+              <w:top w:type="dxa" w:w="80"/>
+              <w:left w:type="dxa" w:w="100"/>
+              <w:bottom w:type="dxa" w:w="80"/>
+              <w:right w:type="dxa" w:w="100"/>
+            </w:tcMar>
+            <w:vAlign w:val="center"/>
+          </w:tcPr>
+          <w:p>
+            <w:r>
+              <w:rPr>
+                <w:rFonts w:ascii="Arial" w:cs="Arial" w:eastAsia="Arial" w:hAnsi="Arial"/>
+                <w:b w:val="false"/>
+                <w:bCs w:val="false"/>
+                <w:sz w:val="20"/>
+                <w:szCs w:val="20"/>
+              </w:rPr>
+              <w:t xml:space="preserve">Restricción de tiempo (sección 1.4): lenguaje de dominio previo del estudiante (dos asignaturas cursadas con Spring Boot) en un proyecto individual con plazo corto; Python implicaría una curva de aprendizaje nueva.</w:t>
+            </w:r>
+          </w:p>
+        </w:tc>
+      </w:tr>
+      <w:tr>
+        <w:trPr>
+          <w:cantSplit/>
+        </w:trPr>
+        <w:tc>
+          <w:tcPr>
+            <w:tcW w:type="dxa" w:w="1700"/>
+            <w:tcMar>
+              <w:top w:type="dxa" w:w="80"/>
+              <w:left w:type="dxa" w:w="100"/>
+              <w:bottom w:type="dxa" w:w="80"/>
+              <w:right w:type="dxa" w:w="100"/>
+            </w:tcMar>
+            <w:vAlign w:val="center"/>
+          </w:tcPr>
+          <w:p>
+            <w:r>
+              <w:rPr>
+                <w:rFonts w:ascii="Arial" w:cs="Arial" w:eastAsia="Arial" w:hAnsi="Arial"/>
+                <w:b w:val="false"/>
+                <w:bCs w:val="false"/>
+                <w:sz w:val="20"/>
+                <w:szCs w:val="20"/>
+              </w:rPr>
+              <w:t xml:space="preserve">Framework</w:t>
+            </w:r>
+          </w:p>
+        </w:tc>
+        <w:tc>
+          <w:tcPr>
+            <w:tcW w:type="dxa" w:w="2000"/>
+            <w:tcMar>
+              <w:top w:type="dxa" w:w="80"/>
+              <w:left w:type="dxa" w:w="100"/>
+              <w:bottom w:type="dxa" w:w="80"/>
+              <w:right w:type="dxa" w:w="100"/>
+            </w:tcMar>
+            <w:vAlign w:val="center"/>
+          </w:tcPr>
+          <w:p>
+            <w:r>
+              <w:rPr>
+                <w:rFonts w:ascii="Arial" w:cs="Arial" w:eastAsia="Arial" w:hAnsi="Arial"/>
+                <w:b w:val="false"/>
+                <w:bCs w:val="false"/>
+                <w:sz w:val="20"/>
+                <w:szCs w:val="20"/>
+              </w:rPr>
+              <w:t xml:space="preserve">Spring Boot</w:t>
+            </w:r>
+          </w:p>
+        </w:tc>
+        <w:tc>
+          <w:tcPr>
+            <w:tcW w:type="dxa" w:w="1500"/>
+            <w:tcMar>
+              <w:top w:type="dxa" w:w="80"/>
+              <w:left w:type="dxa" w:w="100"/>
+              <w:bottom w:type="dxa" w:w="80"/>
+              <w:right w:type="dxa" w:w="100"/>
+            </w:tcMar>
+            <w:vAlign w:val="center"/>
+          </w:tcPr>
+          <w:p>
+            <w:r>
+              <w:rPr>
+                <w:rFonts w:ascii="Arial" w:cs="Arial" w:eastAsia="Arial" w:hAnsi="Arial"/>
+                <w:b w:val="false"/>
+                <w:bCs w:val="false"/>
+                <w:sz w:val="20"/>
+                <w:szCs w:val="20"/>
+              </w:rPr>
+              <w:t xml:space="preserve">FastAPI, Django</w:t>
+            </w:r>
+          </w:p>
+        </w:tc>
+        <w:tc>
+          <w:tcPr>
+            <w:tcW w:type="dxa" w:w="3800"/>
+            <w:tcMar>
+              <w:top w:type="dxa" w:w="80"/>
+              <w:left w:type="dxa" w:w="100"/>
+              <w:bottom w:type="dxa" w:w="80"/>
+              <w:right w:type="dxa" w:w="100"/>
+            </w:tcMar>
+            <w:vAlign w:val="center"/>
+          </w:tcPr>
+          <w:p>
+            <w:r>
+              <w:rPr>
+                <w:rFonts w:ascii="Arial" w:cs="Arial" w:eastAsia="Arial" w:hAnsi="Arial"/>
+                <w:b w:val="false"/>
+                <w:bCs w:val="false"/>
+                <w:sz w:val="20"/>
+                <w:szCs w:val="20"/>
+              </w:rPr>
+              <w:t xml:space="preserve">AC-07 (Mantenibilidad): su estructura Controller-Service-Repository materializa las capas del patrón N-Capas y aísla las reglas de negocio en la capa de servicio; incluye validación de datos y documentación OpenAPI. Restricción de tiempo: dominio previo del estudiante.</w:t>
+            </w:r>
+          </w:p>
+        </w:tc>
+      </w:tr>
+      <w:tr>
+        <w:trPr>
+          <w:cantSplit/>
+        </w:trPr>
+        <w:tc>
+          <w:tcPr>
+            <w:tcW w:type="dxa" w:w="1700"/>
+            <w:tcMar>
+              <w:top w:type="dxa" w:w="80"/>
+              <w:left w:type="dxa" w:w="100"/>
+              <w:bottom w:type="dxa" w:w="80"/>
+              <w:right w:type="dxa" w:w="100"/>
+            </w:tcMar>
+            <w:vAlign w:val="center"/>
+          </w:tcPr>
+          <w:p>
+            <w:r>
+              <w:rPr>
+                <w:rFonts w:ascii="Arial" w:cs="Arial" w:eastAsia="Arial" w:hAnsi="Arial"/>
+                <w:b w:val="false"/>
+                <w:bCs w:val="false"/>
+                <w:sz w:val="20"/>
+                <w:szCs w:val="20"/>
+              </w:rPr>
+              <w:t xml:space="preserve">Acceso a datos</w:t>
+            </w:r>
+          </w:p>
+        </w:tc>
+        <w:tc>
+          <w:tcPr>
+            <w:tcW w:type="dxa" w:w="2000"/>
+            <w:tcMar>
+              <w:top w:type="dxa" w:w="80"/>
+              <w:left w:type="dxa" w:w="100"/>
+              <w:bottom w:type="dxa" w:w="80"/>
+              <w:right w:type="dxa" w:w="100"/>
+            </w:tcMar>
+            <w:vAlign w:val="center"/>
+          </w:tcPr>
+          <w:p>
+            <w:r>
+              <w:rPr>
+                <w:rFonts w:ascii="Arial" w:cs="Arial" w:eastAsia="Arial" w:hAnsi="Arial"/>
+                <w:b w:val="false"/>
+                <w:bCs w:val="false"/>
+                <w:sz w:val="20"/>
+                <w:szCs w:val="20"/>
+              </w:rPr>
+              <w:t xml:space="preserve">Spring Data JPA (Hibernate) + Flyway</w:t>
+            </w:r>
+          </w:p>
+        </w:tc>
+        <w:tc>
+          <w:tcPr>
+            <w:tcW w:type="dxa" w:w="1500"/>
+            <w:tcMar>
+              <w:top w:type="dxa" w:w="80"/>
+              <w:left w:type="dxa" w:w="100"/>
+              <w:bottom w:type="dxa" w:w="80"/>
+              <w:right w:type="dxa" w:w="100"/>
+            </w:tcMar>
+            <w:vAlign w:val="center"/>
+          </w:tcPr>
+          <w:p>
+            <w:r>
+              <w:rPr>
+                <w:rFonts w:ascii="Arial" w:cs="Arial" w:eastAsia="Arial" w:hAnsi="Arial"/>
+                <w:b w:val="false"/>
+                <w:bCs w:val="false"/>
+                <w:sz w:val="20"/>
+                <w:szCs w:val="20"/>
+              </w:rPr>
+              <w:t xml:space="preserve">JDBC / SQL nativo</w:t>
+            </w:r>
+          </w:p>
+        </w:tc>
+        <w:tc>
+          <w:tcPr>
+            <w:tcW w:type="dxa" w:w="3800"/>
+            <w:tcMar>
+              <w:top w:type="dxa" w:w="80"/>
+              <w:left w:type="dxa" w:w="100"/>
+              <w:bottom w:type="dxa" w:w="80"/>
+              <w:right w:type="dxa" w:w="100"/>
+            </w:tcMar>
+            <w:vAlign w:val="center"/>
+          </w:tcPr>
+          <w:p>
+            <w:r>
+              <w:rPr>
+                <w:rFonts w:ascii="Arial" w:cs="Arial" w:eastAsia="Arial" w:hAnsi="Arial"/>
+                <w:b w:val="false"/>
+                <w:bCs w:val="false"/>
+                <w:sz w:val="20"/>
+                <w:szCs w:val="20"/>
+              </w:rPr>
+              <w:t xml:space="preserve">AC-07: mantiene el modelo de datos separado de las reglas de negocio mediante repositorios y versiona los cambios del esquema con migraciones.</w:t>
+            </w:r>
+          </w:p>
+        </w:tc>
+      </w:tr>
+      <w:tr>
+        <w:trPr>
+          <w:cantSplit/>
+        </w:trPr>
+        <w:tc>
+          <w:tcPr>
+            <w:tcW w:type="dxa" w:w="1700"/>
+            <w:tcMar>
+              <w:top w:type="dxa" w:w="80"/>
+              <w:left w:type="dxa" w:w="100"/>
+              <w:bottom w:type="dxa" w:w="80"/>
+              <w:right w:type="dxa" w:w="100"/>
+            </w:tcMar>
+            <w:vAlign w:val="center"/>
+          </w:tcPr>
+          <w:p>
+            <w:r>
+              <w:rPr>
+                <w:rFonts w:ascii="Arial" w:cs="Arial" w:eastAsia="Arial" w:hAnsi="Arial"/>
+                <w:b w:val="false"/>
+                <w:bCs w:val="false"/>
+                <w:sz w:val="20"/>
+                <w:szCs w:val="20"/>
+              </w:rPr>
+              <w:t xml:space="preserve">Base de datos</w:t>
+            </w:r>
+          </w:p>
+        </w:tc>
+        <w:tc>
+          <w:tcPr>
+            <w:tcW w:type="dxa" w:w="2000"/>
+            <w:tcMar>
+              <w:top w:type="dxa" w:w="80"/>
+              <w:left w:type="dxa" w:w="100"/>
+              <w:bottom w:type="dxa" w:w="80"/>
+              <w:right w:type="dxa" w:w="100"/>
+            </w:tcMar>
+            <w:vAlign w:val="center"/>
+          </w:tcPr>
+          <w:p>
+            <w:r>
+              <w:rPr>
+                <w:rFonts w:ascii="Arial" w:cs="Arial" w:eastAsia="Arial" w:hAnsi="Arial"/>
+                <w:b w:val="false"/>
+                <w:bCs w:val="false"/>
+                <w:sz w:val="20"/>
+                <w:szCs w:val="20"/>
+              </w:rPr>
+              <w:t xml:space="preserve">PostgreSQL</w:t>
+            </w:r>
+          </w:p>
+        </w:tc>
+        <w:tc>
+          <w:tcPr>
+            <w:tcW w:type="dxa" w:w="1500"/>
+            <w:tcMar>
+              <w:top w:type="dxa" w:w="80"/>
+              <w:left w:type="dxa" w:w="100"/>
+              <w:bottom w:type="dxa" w:w="80"/>
+              <w:right w:type="dxa" w:w="100"/>
+            </w:tcMar>
+            <w:vAlign w:val="center"/>
+          </w:tcPr>
+          <w:p>
+            <w:r>
+              <w:rPr>
+                <w:rFonts w:ascii="Arial" w:cs="Arial" w:eastAsia="Arial" w:hAnsi="Arial"/>
+                <w:b w:val="false"/>
+                <w:bCs w:val="false"/>
+                <w:sz w:val="20"/>
+                <w:szCs w:val="20"/>
+              </w:rPr>
+              <w:t xml:space="preserve">MongoDB</w:t>
+            </w:r>
+          </w:p>
+        </w:tc>
+        <w:tc>
+          <w:tcPr>
+            <w:tcW w:type="dxa" w:w="3800"/>
+            <w:tcMar>
+              <w:top w:type="dxa" w:w="80"/>
+              <w:left w:type="dxa" w:w="100"/>
+              <w:bottom w:type="dxa" w:w="80"/>
+              <w:right w:type="dxa" w:w="100"/>
+            </w:tcMar>
+            <w:vAlign w:val="center"/>
+          </w:tcPr>
+          <w:p>
+            <w:r>
+              <w:rPr>
+                <w:rFonts w:ascii="Arial" w:cs="Arial" w:eastAsia="Arial" w:hAnsi="Arial"/>
+                <w:b w:val="false"/>
+                <w:bCs w:val="false"/>
+                <w:sz w:val="20"/>
+                <w:szCs w:val="20"/>
+              </w:rPr>
+              <w:t xml:space="preserve">Datos relacionales (sensor, lectura, alerta) que requieren integridad referencial y restricciones (FK, CHECK, UNIQUE) para el historial de RF-03 y RF-05; licencia libre (RA-02).</w:t>
+            </w:r>
+          </w:p>
+        </w:tc>
+      </w:tr>
+      <w:tr>
+        <w:trPr>
+          <w:cantSplit/>
+        </w:trPr>
+        <w:tc>
+          <w:tcPr>
+            <w:tcW w:type="dxa" w:w="1700"/>
+            <w:tcMar>
+              <w:top w:type="dxa" w:w="80"/>
+              <w:left w:type="dxa" w:w="100"/>
+              <w:bottom w:type="dxa" w:w="80"/>
+              <w:right w:type="dxa" w:w="100"/>
+            </w:tcMar>
+            <w:vAlign w:val="center"/>
+          </w:tcPr>
+          <w:p>
+            <w:r>
+              <w:rPr>
+                <w:rFonts w:ascii="Arial" w:cs="Arial" w:eastAsia="Arial" w:hAnsi="Arial"/>
+                <w:b w:val="false"/>
+                <w:bCs w:val="false"/>
+                <w:sz w:val="20"/>
+                <w:szCs w:val="20"/>
+              </w:rPr>
+              <w:t xml:space="preserve">Frontend</w:t>
+            </w:r>
+          </w:p>
+        </w:tc>
+        <w:tc>
+          <w:tcPr>
+            <w:tcW w:type="dxa" w:w="2000"/>
+            <w:tcMar>
+              <w:top w:type="dxa" w:w="80"/>
+              <w:left w:type="dxa" w:w="100"/>
+              <w:bottom w:type="dxa" w:w="80"/>
+              <w:right w:type="dxa" w:w="100"/>
+            </w:tcMar>
+            <w:vAlign w:val="center"/>
+          </w:tcPr>
+          <w:p>
+            <w:r>
+              <w:rPr>
+                <w:rFonts w:ascii="Arial" w:cs="Arial" w:eastAsia="Arial" w:hAnsi="Arial"/>
+                <w:b w:val="false"/>
+                <w:bCs w:val="false"/>
+                <w:sz w:val="20"/>
+                <w:szCs w:val="20"/>
+              </w:rPr>
+              <w:t xml:space="preserve">React (Vite) como aplicación separada</w:t>
+            </w:r>
+          </w:p>
+        </w:tc>
+        <w:tc>
+          <w:tcPr>
+            <w:tcW w:type="dxa" w:w="1500"/>
+            <w:tcMar>
+              <w:top w:type="dxa" w:w="80"/>
+              <w:left w:type="dxa" w:w="100"/>
+              <w:bottom w:type="dxa" w:w="80"/>
+              <w:right w:type="dxa" w:w="100"/>
+            </w:tcMar>
+            <w:vAlign w:val="center"/>
+          </w:tcPr>
+          <w:p>
+            <w:r>
+              <w:rPr>
+                <w:rFonts w:ascii="Arial" w:cs="Arial" w:eastAsia="Arial" w:hAnsi="Arial"/>
+                <w:b w:val="false"/>
+                <w:bCs w:val="false"/>
+                <w:sz w:val="20"/>
+                <w:szCs w:val="20"/>
+              </w:rPr>
+              <w:t xml:space="preserve">HTML y JavaScript servidos desde Spring Boot</w:t>
+            </w:r>
+          </w:p>
+        </w:tc>
+        <w:tc>
+          <w:tcPr>
+            <w:tcW w:type="dxa" w:w="3800"/>
+            <w:tcMar>
+              <w:top w:type="dxa" w:w="80"/>
+              <w:left w:type="dxa" w:w="100"/>
+              <w:bottom w:type="dxa" w:w="80"/>
+              <w:right w:type="dxa" w:w="100"/>
+            </w:tcMar>
+            <w:vAlign w:val="center"/>
+          </w:tcPr>
+          <w:p>
+            <w:r>
+              <w:rPr>
+                <w:rFonts w:ascii="Arial" w:cs="Arial" w:eastAsia="Arial" w:hAnsi="Arial"/>
+                <w:b w:val="false"/>
+                <w:bCs w:val="false"/>
+                <w:sz w:val="20"/>
+                <w:szCs w:val="20"/>
+              </w:rPr>
+              <w:t xml:space="preserve">AC-04 (Usabilidad): interfaz mínima para consultar alertas y estado de sensores (HU-03) y configurar umbrales (HU-02). Restricción de tiempo: dominio previo del estudiante en React; consume la API REST del backend con JWT.</w:t>
+            </w:r>
+          </w:p>
+        </w:tc>
+      </w:tr>
+      <w:tr>
+        <w:trPr>
+          <w:cantSplit/>
+        </w:trPr>
+        <w:tc>
+          <w:tcPr>
+            <w:tcW w:type="dxa" w:w="1700"/>
+            <w:tcMar>
+              <w:top w:type="dxa" w:w="80"/>
+              <w:left w:type="dxa" w:w="100"/>
+              <w:bottom w:type="dxa" w:w="80"/>
+              <w:right w:type="dxa" w:w="100"/>
+            </w:tcMar>
+            <w:vAlign w:val="center"/>
+          </w:tcPr>
+          <w:p>
+            <w:r>
+              <w:rPr>
+                <w:rFonts w:ascii="Arial" w:cs="Arial" w:eastAsia="Arial" w:hAnsi="Arial"/>
+                <w:b w:val="false"/>
+                <w:bCs w:val="false"/>
+                <w:sz w:val="20"/>
+                <w:szCs w:val="20"/>
+              </w:rPr>
+              <w:t xml:space="preserve">Autenticación</w:t>
+            </w:r>
+          </w:p>
+        </w:tc>
+        <w:tc>
+          <w:tcPr>
+            <w:tcW w:type="dxa" w:w="2000"/>
+            <w:tcMar>
+              <w:top w:type="dxa" w:w="80"/>
+              <w:left w:type="dxa" w:w="100"/>
+              <w:bottom w:type="dxa" w:w="80"/>
+              <w:right w:type="dxa" w:w="100"/>
+            </w:tcMar>
+            <w:vAlign w:val="center"/>
+          </w:tcPr>
+          <w:p>
+            <w:r>
+              <w:rPr>
+                <w:rFonts w:ascii="Arial" w:cs="Arial" w:eastAsia="Arial" w:hAnsi="Arial"/>
+                <w:b w:val="false"/>
+                <w:bCs w:val="false"/>
+                <w:sz w:val="20"/>
+                <w:szCs w:val="20"/>
+              </w:rPr>
+              <w:t xml:space="preserve">Spring Security + JWT, con BCrypt y roles administrador y técnico</w:t>
+            </w:r>
+          </w:p>
+        </w:tc>
+        <w:tc>
+          <w:tcPr>
+            <w:tcW w:type="dxa" w:w="1500"/>
+            <w:tcMar>
+              <w:top w:type="dxa" w:w="80"/>
+              <w:left w:type="dxa" w:w="100"/>
+              <w:bottom w:type="dxa" w:w="80"/>
+              <w:right w:type="dxa" w:w="100"/>
+            </w:tcMar>
+            <w:vAlign w:val="center"/>
+          </w:tcPr>
+          <w:p>
+            <w:r>
+              <w:rPr>
+                <w:rFonts w:ascii="Arial" w:cs="Arial" w:eastAsia="Arial" w:hAnsi="Arial"/>
+                <w:b w:val="false"/>
+                <w:bCs w:val="false"/>
+                <w:sz w:val="20"/>
+                <w:szCs w:val="20"/>
+              </w:rPr>
+              <w:t xml:space="preserve">Sesiones en servidor</w:t>
+            </w:r>
+          </w:p>
+        </w:tc>
+        <w:tc>
+          <w:tcPr>
+            <w:tcW w:type="dxa" w:w="3800"/>
+            <w:tcMar>
+              <w:top w:type="dxa" w:w="80"/>
+              <w:left w:type="dxa" w:w="100"/>
+              <w:bottom w:type="dxa" w:w="80"/>
+              <w:right w:type="dxa" w:w="100"/>
+            </w:tcMar>
+            <w:vAlign w:val="center"/>
+          </w:tcPr>
+          <w:p>
+            <w:r>
+              <w:rPr>
+                <w:rFonts w:ascii="Arial" w:cs="Arial" w:eastAsia="Arial" w:hAnsi="Arial"/>
+                <w:b w:val="false"/>
+                <w:bCs w:val="false"/>
+                <w:sz w:val="20"/>
+                <w:szCs w:val="20"/>
+              </w:rPr>
+              <w:t xml:space="preserve">AC-06 (Seguridad) y HU-02: solo el administrador modifica umbrales, porque un umbral alterado puede suprimir una alerta real. JWT evita mantener estado de sesión en el servidor.</w:t>
+            </w:r>
+          </w:p>
+        </w:tc>
+      </w:tr>
+      <w:tr>
+        <w:trPr>
+          <w:cantSplit/>
+        </w:trPr>
+        <w:tc>
+          <w:tcPr>
+            <w:tcW w:type="dxa" w:w="1700"/>
+            <w:tcMar>
+              <w:top w:type="dxa" w:w="80"/>
+              <w:left w:type="dxa" w:w="100"/>
+              <w:bottom w:type="dxa" w:w="80"/>
+              <w:right w:type="dxa" w:w="100"/>
+            </w:tcMar>
+            <w:vAlign w:val="center"/>
+          </w:tcPr>
+          <w:p>
+            <w:r>
+              <w:rPr>
+                <w:rFonts w:ascii="Arial" w:cs="Arial" w:eastAsia="Arial" w:hAnsi="Arial"/>
+                <w:b w:val="false"/>
+                <w:bCs w:val="false"/>
+                <w:sz w:val="20"/>
+                <w:szCs w:val="20"/>
+              </w:rPr>
+              <w:t xml:space="preserve">Pruebas</w:t>
+            </w:r>
+          </w:p>
+        </w:tc>
+        <w:tc>
+          <w:tcPr>
+            <w:tcW w:type="dxa" w:w="2000"/>
+            <w:tcMar>
+              <w:top w:type="dxa" w:w="80"/>
+              <w:left w:type="dxa" w:w="100"/>
+              <w:bottom w:type="dxa" w:w="80"/>
+              <w:right w:type="dxa" w:w="100"/>
+            </w:tcMar>
+            <w:vAlign w:val="center"/>
+          </w:tcPr>
+          <w:p>
+            <w:r>
+              <w:rPr>
+                <w:rFonts w:ascii="Arial" w:cs="Arial" w:eastAsia="Arial" w:hAnsi="Arial"/>
+                <w:b w:val="false"/>
+                <w:bCs w:val="false"/>
+                <w:sz w:val="20"/>
+                <w:szCs w:val="20"/>
+              </w:rPr>
+              <w:t xml:space="preserve">JUnit 5 + Postman</w:t>
+            </w:r>
+          </w:p>
+        </w:tc>
+        <w:tc>
+          <w:tcPr>
+            <w:tcW w:type="dxa" w:w="1500"/>
+            <w:tcMar>
+              <w:top w:type="dxa" w:w="80"/>
+              <w:left w:type="dxa" w:w="100"/>
+              <w:bottom w:type="dxa" w:w="80"/>
+              <w:right w:type="dxa" w:w="100"/>
+            </w:tcMar>
+            <w:vAlign w:val="center"/>
+          </w:tcPr>
+          <w:p>
+            <w:r>
+              <w:rPr>
+                <w:rFonts w:ascii="Arial" w:cs="Arial" w:eastAsia="Arial" w:hAnsi="Arial"/>
+                <w:b w:val="false"/>
+                <w:bCs w:val="false"/>
+                <w:sz w:val="20"/>
+                <w:szCs w:val="20"/>
+              </w:rPr>
+              <w:t xml:space="preserve">Pruebas manuales</w:t>
+            </w:r>
+          </w:p>
+        </w:tc>
+        <w:tc>
+          <w:tcPr>
+            <w:tcW w:type="dxa" w:w="3800"/>
+            <w:tcMar>
+              <w:top w:type="dxa" w:w="80"/>
+              <w:left w:type="dxa" w:w="100"/>
+              <w:bottom w:type="dxa" w:w="80"/>
+              <w:right w:type="dxa" w:w="100"/>
+            </w:tcMar>
+            <w:vAlign w:val="center"/>
+          </w:tcPr>
+          <w:p>
+            <w:r>
+              <w:rPr>
+                <w:rFonts w:ascii="Arial" w:cs="Arial" w:eastAsia="Arial" w:hAnsi="Arial"/>
+                <w:b w:val="false"/>
+                <w:bCs w:val="false"/>
+                <w:sz w:val="20"/>
+                <w:szCs w:val="20"/>
+              </w:rPr>
+              <w:t xml:space="preserve">AC-02 y AC-05: verificación repetible de la evaluación en ≤ 5 s y de la entrega por 2 canales, según los escenarios de la sección 1.3.</w:t>
+            </w:r>
+          </w:p>
+        </w:tc>
+      </w:tr>
+      <w:tr>
+        <w:trPr>
+          <w:cantSplit/>
+        </w:trPr>
+        <w:tc>
+          <w:tcPr>
+            <w:tcW w:type="dxa" w:w="1700"/>
+            <w:tcMar>
+              <w:top w:type="dxa" w:w="80"/>
+              <w:left w:type="dxa" w:w="100"/>
+              <w:bottom w:type="dxa" w:w="80"/>
+              <w:right w:type="dxa" w:w="100"/>
+            </w:tcMar>
+            <w:vAlign w:val="center"/>
+          </w:tcPr>
+          <w:p>
+            <w:r>
+              <w:rPr>
+                <w:rFonts w:ascii="Arial" w:cs="Arial" w:eastAsia="Arial" w:hAnsi="Arial"/>
+                <w:b w:val="false"/>
+                <w:bCs w:val="false"/>
+                <w:sz w:val="20"/>
+                <w:szCs w:val="20"/>
+              </w:rPr>
+              <w:t xml:space="preserve">Control de versiones</w:t>
+            </w:r>
+          </w:p>
+        </w:tc>
+        <w:tc>
+          <w:tcPr>
+            <w:tcW w:type="dxa" w:w="2000"/>
+            <w:tcMar>
+              <w:top w:type="dxa" w:w="80"/>
+              <w:left w:type="dxa" w:w="100"/>
+              <w:bottom w:type="dxa" w:w="80"/>
+              <w:right w:type="dxa" w:w="100"/>
+            </w:tcMar>
+            <w:vAlign w:val="center"/>
+          </w:tcPr>
+          <w:p>
+            <w:r>
+              <w:rPr>
+                <w:rFonts w:ascii="Arial" w:cs="Arial" w:eastAsia="Arial" w:hAnsi="Arial"/>
+                <w:b w:val="false"/>
+                <w:bCs w:val="false"/>
+                <w:sz w:val="20"/>
+                <w:szCs w:val="20"/>
+              </w:rPr>
+              <w:t xml:space="preserve">Git + GitHub</w:t>
+            </w:r>
+          </w:p>
+        </w:tc>
+        <w:tc>
+          <w:tcPr>
+            <w:tcW w:type="dxa" w:w="1500"/>
+            <w:tcMar>
+              <w:top w:type="dxa" w:w="80"/>
+              <w:left w:type="dxa" w:w="100"/>
+              <w:bottom w:type="dxa" w:w="80"/>
+              <w:right w:type="dxa" w:w="100"/>
+            </w:tcMar>
+            <w:vAlign w:val="center"/>
+          </w:tcPr>
+          <w:p>
+            <w:r>
+              <w:rPr>
+                <w:rFonts w:ascii="Arial" w:cs="Arial" w:eastAsia="Arial" w:hAnsi="Arial"/>
+                <w:b w:val="false"/>
+                <w:bCs w:val="false"/>
+                <w:sz w:val="20"/>
+                <w:szCs w:val="20"/>
+              </w:rPr>
+              <w:t xml:space="preserve">Ninguna</w:t>
+            </w:r>
+          </w:p>
+        </w:tc>
+        <w:tc>
+          <w:tcPr>
+            <w:tcW w:type="dxa" w:w="3800"/>
+            <w:tcMar>
+              <w:top w:type="dxa" w:w="80"/>
+              <w:left w:type="dxa" w:w="100"/>
+              <w:bottom w:type="dxa" w:w="80"/>
+              <w:right w:type="dxa" w:w="100"/>
+            </w:tcMar>
+            <w:vAlign w:val="center"/>
+          </w:tcPr>
+          <w:p>
+            <w:r>
+              <w:rPr>
+                <w:rFonts w:ascii="Arial" w:cs="Arial" w:eastAsia="Arial" w:hAnsi="Arial"/>
+                <w:b w:val="false"/>
+                <w:bCs w:val="false"/>
+                <w:sz w:val="20"/>
+                <w:szCs w:val="20"/>
+              </w:rPr>
+              <w:t xml:space="preserve">Restricción del curso: el DAS, los ADRs y el código se versionan en el repositorio del proyecto.</w:t>
+            </w:r>
+          </w:p>
+        </w:tc>
+      </w:tr>
+      <w:tr>
+        <w:trPr>
+          <w:cantSplit/>
+        </w:trPr>
+        <w:tc>
+          <w:tcPr>
+            <w:tcW w:type="dxa" w:w="1700"/>
+            <w:tcMar>
+              <w:top w:type="dxa" w:w="80"/>
+              <w:left w:type="dxa" w:w="100"/>
+              <w:bottom w:type="dxa" w:w="80"/>
+              <w:right w:type="dxa" w:w="100"/>
+            </w:tcMar>
+            <w:vAlign w:val="center"/>
+          </w:tcPr>
+          <w:p>
+            <w:r>
+              <w:rPr>
+                <w:rFonts w:ascii="Arial" w:cs="Arial" w:eastAsia="Arial" w:hAnsi="Arial"/>
+                <w:b w:val="false"/>
+                <w:bCs w:val="false"/>
+                <w:sz w:val="20"/>
+                <w:szCs w:val="20"/>
+              </w:rPr>
+              <w:t xml:space="preserve">Entrada de SMS</w:t>
+            </w:r>
+          </w:p>
+        </w:tc>
+        <w:tc>
+          <w:tcPr>
+            <w:tcW w:type="dxa" w:w="2000"/>
+            <w:tcMar>
+              <w:top w:type="dxa" w:w="80"/>
+              <w:left w:type="dxa" w:w="100"/>
+              <w:bottom w:type="dxa" w:w="80"/>
+              <w:right w:type="dxa" w:w="100"/>
+            </w:tcMar>
+            <w:vAlign w:val="center"/>
+          </w:tcPr>
+          <w:p>
+            <w:r>
+              <w:rPr>
+                <w:rFonts w:ascii="Arial" w:cs="Arial" w:eastAsia="Arial" w:hAnsi="Arial"/>
+                <w:b w:val="false"/>
+                <w:bCs w:val="false"/>
+                <w:sz w:val="20"/>
+                <w:szCs w:val="20"/>
+              </w:rPr>
+              <w:t xml:space="preserve">Endpoint HTTP (webhook) que recibe el SMS; en desarrollo se simula con Postman</w:t>
+            </w:r>
+          </w:p>
+        </w:tc>
+        <w:tc>
+          <w:tcPr>
+            <w:tcW w:type="dxa" w:w="1500"/>
+            <w:tcMar>
+              <w:top w:type="dxa" w:w="80"/>
+              <w:left w:type="dxa" w:w="100"/>
+              <w:bottom w:type="dxa" w:w="80"/>
+              <w:right w:type="dxa" w:w="100"/>
+            </w:tcMar>
+            <w:vAlign w:val="center"/>
+          </w:tcPr>
+          <w:p>
+            <w:r>
+              <w:rPr>
+                <w:rFonts w:ascii="Arial" w:cs="Arial" w:eastAsia="Arial" w:hAnsi="Arial"/>
+                <w:b w:val="false"/>
+                <w:bCs w:val="false"/>
+                <w:sz w:val="20"/>
+                <w:szCs w:val="20"/>
+              </w:rPr>
+              <w:t xml:space="preserve">Contratar un gateway SMS de pago en esta etapa</w:t>
+            </w:r>
+          </w:p>
+        </w:tc>
+        <w:tc>
+          <w:tcPr>
+            <w:tcW w:type="dxa" w:w="3800"/>
+            <w:tcMar>
+              <w:top w:type="dxa" w:w="80"/>
+              <w:left w:type="dxa" w:w="100"/>
+              <w:bottom w:type="dxa" w:w="80"/>
+              <w:right w:type="dxa" w:w="100"/>
+            </w:tcMar>
+            <w:vAlign w:val="center"/>
+          </w:tcPr>
+          <w:p>
+            <w:r>
+              <w:rPr>
+                <w:rFonts w:ascii="Arial" w:cs="Arial" w:eastAsia="Arial" w:hAnsi="Arial"/>
+                <w:b w:val="false"/>
+                <w:bCs w:val="false"/>
+                <w:sz w:val="20"/>
+                <w:szCs w:val="20"/>
+              </w:rPr>
+              <w:t xml:space="preserve">RT-02 y RA-02: el canal de los sensores sigue siendo SMS; el mensaje llega al sistema como una petición HTTP, sin costo de un gateway de pago.</w:t>
+            </w:r>
+          </w:p>
+        </w:tc>
+      </w:tr>
+      <w:tr>
+        <w:trPr>
+          <w:cantSplit/>
+        </w:trPr>
+        <w:tc>
+          <w:tcPr>
+            <w:tcW w:type="dxa" w:w="1700"/>
+            <w:tcMar>
+              <w:top w:type="dxa" w:w="80"/>
+              <w:left w:type="dxa" w:w="100"/>
+              <w:bottom w:type="dxa" w:w="80"/>
+              <w:right w:type="dxa" w:w="100"/>
+            </w:tcMar>
+            <w:vAlign w:val="center"/>
+          </w:tcPr>
+          <w:p>
+            <w:r>
+              <w:rPr>
+                <w:rFonts w:ascii="Arial" w:cs="Arial" w:eastAsia="Arial" w:hAnsi="Arial"/>
+                <w:b w:val="false"/>
+                <w:bCs w:val="false"/>
+                <w:sz w:val="20"/>
+                <w:szCs w:val="20"/>
+              </w:rPr>
+              <w:t xml:space="preserve">Canales de salida</w:t>
+            </w:r>
+          </w:p>
+        </w:tc>
+        <w:tc>
+          <w:tcPr>
+            <w:tcW w:type="dxa" w:w="2000"/>
+            <w:tcMar>
+              <w:top w:type="dxa" w:w="80"/>
+              <w:left w:type="dxa" w:w="100"/>
+              <w:bottom w:type="dxa" w:w="80"/>
+              <w:right w:type="dxa" w:w="100"/>
+            </w:tcMar>
+            <w:vAlign w:val="center"/>
+          </w:tcPr>
+          <w:p>
+            <w:r>
+              <w:rPr>
+                <w:rFonts w:ascii="Arial" w:cs="Arial" w:eastAsia="Arial" w:hAnsi="Arial"/>
+                <w:b w:val="false"/>
+                <w:bCs w:val="false"/>
+                <w:sz w:val="20"/>
+                <w:szCs w:val="20"/>
+              </w:rPr>
+              <w:t xml:space="preserve">Correo (SMTP) + Telegram Bot</w:t>
+            </w:r>
+          </w:p>
+        </w:tc>
+        <w:tc>
+          <w:tcPr>
+            <w:tcW w:type="dxa" w:w="1500"/>
+            <w:tcMar>
+              <w:top w:type="dxa" w:w="80"/>
+              <w:left w:type="dxa" w:w="100"/>
+              <w:bottom w:type="dxa" w:w="80"/>
+              <w:right w:type="dxa" w:w="100"/>
+            </w:tcMar>
+            <w:vAlign w:val="center"/>
+          </w:tcPr>
+          <w:p>
+            <w:r>
+              <w:rPr>
+                <w:rFonts w:ascii="Arial" w:cs="Arial" w:eastAsia="Arial" w:hAnsi="Arial"/>
+                <w:b w:val="false"/>
+                <w:bCs w:val="false"/>
+                <w:sz w:val="20"/>
+                <w:szCs w:val="20"/>
+              </w:rPr>
+              <w:t xml:space="preserve">SMS saliente por gateway de pago</w:t>
+            </w:r>
+          </w:p>
+        </w:tc>
+        <w:tc>
+          <w:tcPr>
+            <w:tcW w:type="dxa" w:w="3800"/>
+            <w:tcMar>
+              <w:top w:type="dxa" w:w="80"/>
+              <w:left w:type="dxa" w:w="100"/>
+              <w:bottom w:type="dxa" w:w="80"/>
+              <w:right w:type="dxa" w:w="100"/>
+            </w:tcMar>
+            <w:vAlign w:val="center"/>
+          </w:tcPr>
+          <w:p>
+            <w:r>
+              <w:rPr>
+                <w:rFonts w:ascii="Arial" w:cs="Arial" w:eastAsia="Arial" w:hAnsi="Arial"/>
+                <w:b w:val="false"/>
+                <w:bCs w:val="false"/>
+                <w:sz w:val="20"/>
+                <w:szCs w:val="20"/>
+              </w:rPr>
+              <w:t xml:space="preserve">AC-05 (Confiabilidad): dos canales independientes, ambos sin costo (RA-02), de modo que la falla de uno no impide la entrega por el otro.</w:t>
+            </w:r>
+          </w:p>
+        </w:tc>
+      </w:tr>
+    </w:tbl>
+    <w:p>
+      <w:pPr>
+        <w:spacing w:after="120"/>
+      </w:pPr>
+    </w:p>
+    <w:p>
+      <w:pPr>
+        <w:spacing w:after="160" w:line="276"/>
+        <w:jc w:val="both"/>
+      </w:pPr>
+      <w:r>
+        <w:rPr>
+          <w:rFonts w:ascii="Arial" w:cs="Arial" w:eastAsia="Arial" w:hAnsi="Arial"/>
+          <w:i/>
+          <w:iCs/>
+          <w:sz w:val="24"/>
+          <w:szCs w:val="24"/>
+        </w:rPr>
+        <w:t xml:space="preserve">Nota: las versiones exactas de cada tecnología se fijarán al iniciar la implementación.</w:t>
+      </w:r>
+    </w:p>
     <w:sectPr>
       <w:footerReference w:type="default" r:id="rId7"/>
       <w:pgSz w:w="11906" w:h="16838" w:orient="portrait"/>

</xml_diff>

<commit_message>
docs: agregar columna de versión a la pila tecnológica del DAS v0.2
</commit_message>
<xml_diff>
--- a/docs/DAS.docx
+++ b/docs/DAS.docx
@@ -4507,9 +4507,10 @@
       </w:tblPr>
       <w:tblGrid>
         <w:gridCol w:w="1700"/>
-        <w:gridCol w:w="2000"/>
-        <w:gridCol w:w="1500"/>
-        <w:gridCol w:w="3800"/>
+        <w:gridCol w:w="1600"/>
+        <w:gridCol w:w="1100"/>
+        <w:gridCol w:w="1300"/>
+        <w:gridCol w:w="3300"/>
       </w:tblGrid>
       <w:tr>
         <w:trPr>
@@ -4543,7 +4544,7 @@
         </w:tc>
         <w:tc>
           <w:tcPr>
-            <w:tcW w:type="dxa" w:w="2000"/>
+            <w:tcW w:type="dxa" w:w="1600"/>
             <w:shd w:fill="1F4E79" w:val="clear"/>
             <w:tcMar>
               <w:top w:type="dxa" w:w="80"/>
@@ -4569,7 +4570,7 @@
         </w:tc>
         <w:tc>
           <w:tcPr>
-            <w:tcW w:type="dxa" w:w="1500"/>
+            <w:tcW w:type="dxa" w:w="1100"/>
             <w:shd w:fill="1F4E79" w:val="clear"/>
             <w:tcMar>
               <w:top w:type="dxa" w:w="80"/>
@@ -4589,13 +4590,39 @@
                 <w:sz w:val="20"/>
                 <w:szCs w:val="20"/>
               </w:rPr>
+              <w:t xml:space="preserve">Versión</w:t>
+            </w:r>
+          </w:p>
+        </w:tc>
+        <w:tc>
+          <w:tcPr>
+            <w:tcW w:type="dxa" w:w="1300"/>
+            <w:shd w:fill="1F4E79" w:val="clear"/>
+            <w:tcMar>
+              <w:top w:type="dxa" w:w="80"/>
+              <w:left w:type="dxa" w:w="100"/>
+              <w:bottom w:type="dxa" w:w="80"/>
+              <w:right w:type="dxa" w:w="100"/>
+            </w:tcMar>
+            <w:vAlign w:val="center"/>
+          </w:tcPr>
+          <w:p>
+            <w:r>
+              <w:rPr>
+                <w:rFonts w:ascii="Arial" w:cs="Arial" w:eastAsia="Arial" w:hAnsi="Arial"/>
+                <w:b/>
+                <w:bCs/>
+                <w:color w:val="FFFFFF"/>
+                <w:sz w:val="20"/>
+                <w:szCs w:val="20"/>
+              </w:rPr>
               <w:t xml:space="preserve">Alternativa descartada</w:t>
             </w:r>
           </w:p>
         </w:tc>
         <w:tc>
           <w:tcPr>
-            <w:tcW w:type="dxa" w:w="3800"/>
+            <w:tcW w:type="dxa" w:w="3300"/>
             <w:shd w:fill="1F4E79" w:val="clear"/>
             <w:tcMar>
               <w:top w:type="dxa" w:w="80"/>
@@ -4650,7 +4677,7 @@
         </w:tc>
         <w:tc>
           <w:tcPr>
-            <w:tcW w:type="dxa" w:w="2000"/>
+            <w:tcW w:type="dxa" w:w="1600"/>
             <w:tcMar>
               <w:top w:type="dxa" w:w="80"/>
               <w:left w:type="dxa" w:w="100"/>
@@ -4674,7 +4701,31 @@
         </w:tc>
         <w:tc>
           <w:tcPr>
-            <w:tcW w:type="dxa" w:w="1500"/>
+            <w:tcW w:type="dxa" w:w="1100"/>
+            <w:tcMar>
+              <w:top w:type="dxa" w:w="80"/>
+              <w:left w:type="dxa" w:w="100"/>
+              <w:bottom w:type="dxa" w:w="80"/>
+              <w:right w:type="dxa" w:w="100"/>
+            </w:tcMar>
+            <w:vAlign w:val="center"/>
+          </w:tcPr>
+          <w:p>
+            <w:r>
+              <w:rPr>
+                <w:rFonts w:ascii="Arial" w:cs="Arial" w:eastAsia="Arial" w:hAnsi="Arial"/>
+                <w:b w:val="false"/>
+                <w:bCs w:val="false"/>
+                <w:sz w:val="20"/>
+                <w:szCs w:val="20"/>
+              </w:rPr>
+              <w:t xml:space="preserve">21 LTS</w:t>
+            </w:r>
+          </w:p>
+        </w:tc>
+        <w:tc>
+          <w:tcPr>
+            <w:tcW w:type="dxa" w:w="1300"/>
             <w:tcMar>
               <w:top w:type="dxa" w:w="80"/>
               <w:left w:type="dxa" w:w="100"/>
@@ -4698,7 +4749,7 @@
         </w:tc>
         <w:tc>
           <w:tcPr>
-            <w:tcW w:type="dxa" w:w="3800"/>
+            <w:tcW w:type="dxa" w:w="3300"/>
             <w:tcMar>
               <w:top w:type="dxa" w:w="80"/>
               <w:left w:type="dxa" w:w="100"/>
@@ -4751,7 +4802,7 @@
         </w:tc>
         <w:tc>
           <w:tcPr>
-            <w:tcW w:type="dxa" w:w="2000"/>
+            <w:tcW w:type="dxa" w:w="1600"/>
             <w:tcMar>
               <w:top w:type="dxa" w:w="80"/>
               <w:left w:type="dxa" w:w="100"/>
@@ -4775,7 +4826,31 @@
         </w:tc>
         <w:tc>
           <w:tcPr>
-            <w:tcW w:type="dxa" w:w="1500"/>
+            <w:tcW w:type="dxa" w:w="1100"/>
+            <w:tcMar>
+              <w:top w:type="dxa" w:w="80"/>
+              <w:left w:type="dxa" w:w="100"/>
+              <w:bottom w:type="dxa" w:w="80"/>
+              <w:right w:type="dxa" w:w="100"/>
+            </w:tcMar>
+            <w:vAlign w:val="center"/>
+          </w:tcPr>
+          <w:p>
+            <w:r>
+              <w:rPr>
+                <w:rFonts w:ascii="Arial" w:cs="Arial" w:eastAsia="Arial" w:hAnsi="Arial"/>
+                <w:b w:val="false"/>
+                <w:bCs w:val="false"/>
+                <w:sz w:val="20"/>
+                <w:szCs w:val="20"/>
+              </w:rPr>
+              <w:t xml:space="preserve">4.1.x</w:t>
+            </w:r>
+          </w:p>
+        </w:tc>
+        <w:tc>
+          <w:tcPr>
+            <w:tcW w:type="dxa" w:w="1300"/>
             <w:tcMar>
               <w:top w:type="dxa" w:w="80"/>
               <w:left w:type="dxa" w:w="100"/>
@@ -4799,7 +4874,7 @@
         </w:tc>
         <w:tc>
           <w:tcPr>
-            <w:tcW w:type="dxa" w:w="3800"/>
+            <w:tcW w:type="dxa" w:w="3300"/>
             <w:tcMar>
               <w:top w:type="dxa" w:w="80"/>
               <w:left w:type="dxa" w:w="100"/>
@@ -4852,7 +4927,7 @@
         </w:tc>
         <w:tc>
           <w:tcPr>
-            <w:tcW w:type="dxa" w:w="2000"/>
+            <w:tcW w:type="dxa" w:w="1600"/>
             <w:tcMar>
               <w:top w:type="dxa" w:w="80"/>
               <w:left w:type="dxa" w:w="100"/>
@@ -4876,7 +4951,31 @@
         </w:tc>
         <w:tc>
           <w:tcPr>
-            <w:tcW w:type="dxa" w:w="1500"/>
+            <w:tcW w:type="dxa" w:w="1100"/>
+            <w:tcMar>
+              <w:top w:type="dxa" w:w="80"/>
+              <w:left w:type="dxa" w:w="100"/>
+              <w:bottom w:type="dxa" w:w="80"/>
+              <w:right w:type="dxa" w:w="100"/>
+            </w:tcMar>
+            <w:vAlign w:val="center"/>
+          </w:tcPr>
+          <w:p>
+            <w:r>
+              <w:rPr>
+                <w:rFonts w:ascii="Arial" w:cs="Arial" w:eastAsia="Arial" w:hAnsi="Arial"/>
+                <w:b w:val="false"/>
+                <w:bCs w:val="false"/>
+                <w:sz w:val="20"/>
+                <w:szCs w:val="20"/>
+              </w:rPr>
+              <w:t xml:space="preserve">Según Spring Boot</w:t>
+            </w:r>
+          </w:p>
+        </w:tc>
+        <w:tc>
+          <w:tcPr>
+            <w:tcW w:type="dxa" w:w="1300"/>
             <w:tcMar>
               <w:top w:type="dxa" w:w="80"/>
               <w:left w:type="dxa" w:w="100"/>
@@ -4900,7 +4999,7 @@
         </w:tc>
         <w:tc>
           <w:tcPr>
-            <w:tcW w:type="dxa" w:w="3800"/>
+            <w:tcW w:type="dxa" w:w="3300"/>
             <w:tcMar>
               <w:top w:type="dxa" w:w="80"/>
               <w:left w:type="dxa" w:w="100"/>
@@ -4953,7 +5052,7 @@
         </w:tc>
         <w:tc>
           <w:tcPr>
-            <w:tcW w:type="dxa" w:w="2000"/>
+            <w:tcW w:type="dxa" w:w="1600"/>
             <w:tcMar>
               <w:top w:type="dxa" w:w="80"/>
               <w:left w:type="dxa" w:w="100"/>
@@ -4977,7 +5076,31 @@
         </w:tc>
         <w:tc>
           <w:tcPr>
-            <w:tcW w:type="dxa" w:w="1500"/>
+            <w:tcW w:type="dxa" w:w="1100"/>
+            <w:tcMar>
+              <w:top w:type="dxa" w:w="80"/>
+              <w:left w:type="dxa" w:w="100"/>
+              <w:bottom w:type="dxa" w:w="80"/>
+              <w:right w:type="dxa" w:w="100"/>
+            </w:tcMar>
+            <w:vAlign w:val="center"/>
+          </w:tcPr>
+          <w:p>
+            <w:r>
+              <w:rPr>
+                <w:rFonts w:ascii="Arial" w:cs="Arial" w:eastAsia="Arial" w:hAnsi="Arial"/>
+                <w:b w:val="false"/>
+                <w:bCs w:val="false"/>
+                <w:sz w:val="20"/>
+                <w:szCs w:val="20"/>
+              </w:rPr>
+              <w:t xml:space="preserve">18</w:t>
+            </w:r>
+          </w:p>
+        </w:tc>
+        <w:tc>
+          <w:tcPr>
+            <w:tcW w:type="dxa" w:w="1300"/>
             <w:tcMar>
               <w:top w:type="dxa" w:w="80"/>
               <w:left w:type="dxa" w:w="100"/>
@@ -5001,7 +5124,7 @@
         </w:tc>
         <w:tc>
           <w:tcPr>
-            <w:tcW w:type="dxa" w:w="3800"/>
+            <w:tcW w:type="dxa" w:w="3300"/>
             <w:tcMar>
               <w:top w:type="dxa" w:w="80"/>
               <w:left w:type="dxa" w:w="100"/>
@@ -5054,7 +5177,7 @@
         </w:tc>
         <w:tc>
           <w:tcPr>
-            <w:tcW w:type="dxa" w:w="2000"/>
+            <w:tcW w:type="dxa" w:w="1600"/>
             <w:tcMar>
               <w:top w:type="dxa" w:w="80"/>
               <w:left w:type="dxa" w:w="100"/>
@@ -5078,7 +5201,31 @@
         </w:tc>
         <w:tc>
           <w:tcPr>
-            <w:tcW w:type="dxa" w:w="1500"/>
+            <w:tcW w:type="dxa" w:w="1100"/>
+            <w:tcMar>
+              <w:top w:type="dxa" w:w="80"/>
+              <w:left w:type="dxa" w:w="100"/>
+              <w:bottom w:type="dxa" w:w="80"/>
+              <w:right w:type="dxa" w:w="100"/>
+            </w:tcMar>
+            <w:vAlign w:val="center"/>
+          </w:tcPr>
+          <w:p>
+            <w:r>
+              <w:rPr>
+                <w:rFonts w:ascii="Arial" w:cs="Arial" w:eastAsia="Arial" w:hAnsi="Arial"/>
+                <w:b w:val="false"/>
+                <w:bCs w:val="false"/>
+                <w:sz w:val="20"/>
+                <w:szCs w:val="20"/>
+              </w:rPr>
+              <w:t xml:space="preserve">React 19.x</w:t>
+            </w:r>
+          </w:p>
+        </w:tc>
+        <w:tc>
+          <w:tcPr>
+            <w:tcW w:type="dxa" w:w="1300"/>
             <w:tcMar>
               <w:top w:type="dxa" w:w="80"/>
               <w:left w:type="dxa" w:w="100"/>
@@ -5102,7 +5249,7 @@
         </w:tc>
         <w:tc>
           <w:tcPr>
-            <w:tcW w:type="dxa" w:w="3800"/>
+            <w:tcW w:type="dxa" w:w="3300"/>
             <w:tcMar>
               <w:top w:type="dxa" w:w="80"/>
               <w:left w:type="dxa" w:w="100"/>
@@ -5155,7 +5302,7 @@
         </w:tc>
         <w:tc>
           <w:tcPr>
-            <w:tcW w:type="dxa" w:w="2000"/>
+            <w:tcW w:type="dxa" w:w="1600"/>
             <w:tcMar>
               <w:top w:type="dxa" w:w="80"/>
               <w:left w:type="dxa" w:w="100"/>
@@ -5179,7 +5326,31 @@
         </w:tc>
         <w:tc>
           <w:tcPr>
-            <w:tcW w:type="dxa" w:w="1500"/>
+            <w:tcW w:type="dxa" w:w="1100"/>
+            <w:tcMar>
+              <w:top w:type="dxa" w:w="80"/>
+              <w:left w:type="dxa" w:w="100"/>
+              <w:bottom w:type="dxa" w:w="80"/>
+              <w:right w:type="dxa" w:w="100"/>
+            </w:tcMar>
+            <w:vAlign w:val="center"/>
+          </w:tcPr>
+          <w:p>
+            <w:r>
+              <w:rPr>
+                <w:rFonts w:ascii="Arial" w:cs="Arial" w:eastAsia="Arial" w:hAnsi="Arial"/>
+                <w:b w:val="false"/>
+                <w:bCs w:val="false"/>
+                <w:sz w:val="20"/>
+                <w:szCs w:val="20"/>
+              </w:rPr>
+              <w:t xml:space="preserve">Según Spring Boot</w:t>
+            </w:r>
+          </w:p>
+        </w:tc>
+        <w:tc>
+          <w:tcPr>
+            <w:tcW w:type="dxa" w:w="1300"/>
             <w:tcMar>
               <w:top w:type="dxa" w:w="80"/>
               <w:left w:type="dxa" w:w="100"/>
@@ -5203,7 +5374,7 @@
         </w:tc>
         <w:tc>
           <w:tcPr>
-            <w:tcW w:type="dxa" w:w="3800"/>
+            <w:tcW w:type="dxa" w:w="3300"/>
             <w:tcMar>
               <w:top w:type="dxa" w:w="80"/>
               <w:left w:type="dxa" w:w="100"/>
@@ -5256,31 +5427,55 @@
         </w:tc>
         <w:tc>
           <w:tcPr>
-            <w:tcW w:type="dxa" w:w="2000"/>
-            <w:tcMar>
-              <w:top w:type="dxa" w:w="80"/>
-              <w:left w:type="dxa" w:w="100"/>
-              <w:bottom w:type="dxa" w:w="80"/>
-              <w:right w:type="dxa" w:w="100"/>
-            </w:tcMar>
-            <w:vAlign w:val="center"/>
-          </w:tcPr>
-          <w:p>
-            <w:r>
-              <w:rPr>
-                <w:rFonts w:ascii="Arial" w:cs="Arial" w:eastAsia="Arial" w:hAnsi="Arial"/>
-                <w:b w:val="false"/>
-                <w:bCs w:val="false"/>
-                <w:sz w:val="20"/>
-                <w:szCs w:val="20"/>
-              </w:rPr>
-              <w:t xml:space="preserve">JUnit 5 + Postman</w:t>
-            </w:r>
-          </w:p>
-        </w:tc>
-        <w:tc>
-          <w:tcPr>
-            <w:tcW w:type="dxa" w:w="1500"/>
+            <w:tcW w:type="dxa" w:w="1600"/>
+            <w:tcMar>
+              <w:top w:type="dxa" w:w="80"/>
+              <w:left w:type="dxa" w:w="100"/>
+              <w:bottom w:type="dxa" w:w="80"/>
+              <w:right w:type="dxa" w:w="100"/>
+            </w:tcMar>
+            <w:vAlign w:val="center"/>
+          </w:tcPr>
+          <w:p>
+            <w:r>
+              <w:rPr>
+                <w:rFonts w:ascii="Arial" w:cs="Arial" w:eastAsia="Arial" w:hAnsi="Arial"/>
+                <w:b w:val="false"/>
+                <w:bCs w:val="false"/>
+                <w:sz w:val="20"/>
+                <w:szCs w:val="20"/>
+              </w:rPr>
+              <w:t xml:space="preserve">JUnit + Postman</w:t>
+            </w:r>
+          </w:p>
+        </w:tc>
+        <w:tc>
+          <w:tcPr>
+            <w:tcW w:type="dxa" w:w="1100"/>
+            <w:tcMar>
+              <w:top w:type="dxa" w:w="80"/>
+              <w:left w:type="dxa" w:w="100"/>
+              <w:bottom w:type="dxa" w:w="80"/>
+              <w:right w:type="dxa" w:w="100"/>
+            </w:tcMar>
+            <w:vAlign w:val="center"/>
+          </w:tcPr>
+          <w:p>
+            <w:r>
+              <w:rPr>
+                <w:rFonts w:ascii="Arial" w:cs="Arial" w:eastAsia="Arial" w:hAnsi="Arial"/>
+                <w:b w:val="false"/>
+                <w:bCs w:val="false"/>
+                <w:sz w:val="20"/>
+                <w:szCs w:val="20"/>
+              </w:rPr>
+              <w:t xml:space="preserve">Según Spring Boot (JUnit)</w:t>
+            </w:r>
+          </w:p>
+        </w:tc>
+        <w:tc>
+          <w:tcPr>
+            <w:tcW w:type="dxa" w:w="1300"/>
             <w:tcMar>
               <w:top w:type="dxa" w:w="80"/>
               <w:left w:type="dxa" w:w="100"/>
@@ -5304,7 +5499,7 @@
         </w:tc>
         <w:tc>
           <w:tcPr>
-            <w:tcW w:type="dxa" w:w="3800"/>
+            <w:tcW w:type="dxa" w:w="3300"/>
             <w:tcMar>
               <w:top w:type="dxa" w:w="80"/>
               <w:left w:type="dxa" w:w="100"/>
@@ -5357,7 +5552,7 @@
         </w:tc>
         <w:tc>
           <w:tcPr>
-            <w:tcW w:type="dxa" w:w="2000"/>
+            <w:tcW w:type="dxa" w:w="1600"/>
             <w:tcMar>
               <w:top w:type="dxa" w:w="80"/>
               <w:left w:type="dxa" w:w="100"/>
@@ -5381,7 +5576,31 @@
         </w:tc>
         <w:tc>
           <w:tcPr>
-            <w:tcW w:type="dxa" w:w="1500"/>
+            <w:tcW w:type="dxa" w:w="1100"/>
+            <w:tcMar>
+              <w:top w:type="dxa" w:w="80"/>
+              <w:left w:type="dxa" w:w="100"/>
+              <w:bottom w:type="dxa" w:w="80"/>
+              <w:right w:type="dxa" w:w="100"/>
+            </w:tcMar>
+            <w:vAlign w:val="center"/>
+          </w:tcPr>
+          <w:p>
+            <w:r>
+              <w:rPr>
+                <w:rFonts w:ascii="Arial" w:cs="Arial" w:eastAsia="Arial" w:hAnsi="Arial"/>
+                <w:b w:val="false"/>
+                <w:bCs w:val="false"/>
+                <w:sz w:val="20"/>
+                <w:szCs w:val="20"/>
+              </w:rPr>
+              <w:t xml:space="preserve">—</w:t>
+            </w:r>
+          </w:p>
+        </w:tc>
+        <w:tc>
+          <w:tcPr>
+            <w:tcW w:type="dxa" w:w="1300"/>
             <w:tcMar>
               <w:top w:type="dxa" w:w="80"/>
               <w:left w:type="dxa" w:w="100"/>
@@ -5405,7 +5624,7 @@
         </w:tc>
         <w:tc>
           <w:tcPr>
-            <w:tcW w:type="dxa" w:w="3800"/>
+            <w:tcW w:type="dxa" w:w="3300"/>
             <w:tcMar>
               <w:top w:type="dxa" w:w="80"/>
               <w:left w:type="dxa" w:w="100"/>
@@ -5458,7 +5677,7 @@
         </w:tc>
         <w:tc>
           <w:tcPr>
-            <w:tcW w:type="dxa" w:w="2000"/>
+            <w:tcW w:type="dxa" w:w="1600"/>
             <w:tcMar>
               <w:top w:type="dxa" w:w="80"/>
               <w:left w:type="dxa" w:w="100"/>
@@ -5482,7 +5701,31 @@
         </w:tc>
         <w:tc>
           <w:tcPr>
-            <w:tcW w:type="dxa" w:w="1500"/>
+            <w:tcW w:type="dxa" w:w="1100"/>
+            <w:tcMar>
+              <w:top w:type="dxa" w:w="80"/>
+              <w:left w:type="dxa" w:w="100"/>
+              <w:bottom w:type="dxa" w:w="80"/>
+              <w:right w:type="dxa" w:w="100"/>
+            </w:tcMar>
+            <w:vAlign w:val="center"/>
+          </w:tcPr>
+          <w:p>
+            <w:r>
+              <w:rPr>
+                <w:rFonts w:ascii="Arial" w:cs="Arial" w:eastAsia="Arial" w:hAnsi="Arial"/>
+                <w:b w:val="false"/>
+                <w:bCs w:val="false"/>
+                <w:sz w:val="20"/>
+                <w:szCs w:val="20"/>
+              </w:rPr>
+              <w:t xml:space="preserve">—</w:t>
+            </w:r>
+          </w:p>
+        </w:tc>
+        <w:tc>
+          <w:tcPr>
+            <w:tcW w:type="dxa" w:w="1300"/>
             <w:tcMar>
               <w:top w:type="dxa" w:w="80"/>
               <w:left w:type="dxa" w:w="100"/>
@@ -5506,7 +5749,7 @@
         </w:tc>
         <w:tc>
           <w:tcPr>
-            <w:tcW w:type="dxa" w:w="3800"/>
+            <w:tcW w:type="dxa" w:w="3300"/>
             <w:tcMar>
               <w:top w:type="dxa" w:w="80"/>
               <w:left w:type="dxa" w:w="100"/>
@@ -5559,7 +5802,7 @@
         </w:tc>
         <w:tc>
           <w:tcPr>
-            <w:tcW w:type="dxa" w:w="2000"/>
+            <w:tcW w:type="dxa" w:w="1600"/>
             <w:tcMar>
               <w:top w:type="dxa" w:w="80"/>
               <w:left w:type="dxa" w:w="100"/>
@@ -5583,7 +5826,31 @@
         </w:tc>
         <w:tc>
           <w:tcPr>
-            <w:tcW w:type="dxa" w:w="1500"/>
+            <w:tcW w:type="dxa" w:w="1100"/>
+            <w:tcMar>
+              <w:top w:type="dxa" w:w="80"/>
+              <w:left w:type="dxa" w:w="100"/>
+              <w:bottom w:type="dxa" w:w="80"/>
+              <w:right w:type="dxa" w:w="100"/>
+            </w:tcMar>
+            <w:vAlign w:val="center"/>
+          </w:tcPr>
+          <w:p>
+            <w:r>
+              <w:rPr>
+                <w:rFonts w:ascii="Arial" w:cs="Arial" w:eastAsia="Arial" w:hAnsi="Arial"/>
+                <w:b w:val="false"/>
+                <w:bCs w:val="false"/>
+                <w:sz w:val="20"/>
+                <w:szCs w:val="20"/>
+              </w:rPr>
+              <w:t xml:space="preserve">—</w:t>
+            </w:r>
+          </w:p>
+        </w:tc>
+        <w:tc>
+          <w:tcPr>
+            <w:tcW w:type="dxa" w:w="1300"/>
             <w:tcMar>
               <w:top w:type="dxa" w:w="80"/>
               <w:left w:type="dxa" w:w="100"/>
@@ -5607,7 +5874,7 @@
         </w:tc>
         <w:tc>
           <w:tcPr>
-            <w:tcW w:type="dxa" w:w="3800"/>
+            <w:tcW w:type="dxa" w:w="3300"/>
             <w:tcMar>
               <w:top w:type="dxa" w:w="80"/>
               <w:left w:type="dxa" w:w="100"/>
@@ -5649,7 +5916,7 @@
           <w:sz w:val="24"/>
           <w:szCs w:val="24"/>
         </w:rPr>
-        <w:t xml:space="preserve">Nota: las versiones exactas de cada tecnología se fijarán al iniciar la implementación.</w:t>
+        <w:t xml:space="preserve">Nota: las versiones marcadas como "Según Spring Boot" se heredan de su gestión de dependencias; todas las versiones se confirman al crear el proyecto.</w:t>
       </w:r>
     </w:p>
     <w:sectPr>

</xml_diff>

<commit_message>
docs: agregar Sección 3 (vistas de contexto y contenedores) al DAS v0.3
</commit_message>
<xml_diff>
--- a/docs/DAS.docx
+++ b/docs/DAS.docx
@@ -88,7 +88,7 @@
           <w:sz w:val="24"/>
           <w:szCs w:val="24"/>
         </w:rPr>
-        <w:t xml:space="preserve">Versión del documento: 0.2 — Fecha: 14/10/2026</w:t>
+        <w:t xml:space="preserve">Versión del documento: 0.3 — Fecha: 14/10/2026</w:t>
       </w:r>
     </w:p>
     <w:p>
@@ -5907,6 +5907,13 @@
       <w:pPr>
         <w:spacing w:after="160" w:line="276"/>
         <w:jc w:val="both"/>
+        <w:sectPr>
+          <w:footerReference w:type="default" r:id="rId7"/>
+          <w:pgSz w:w="11906" w:h="16838" w:orient="portrait"/>
+          <w:pgMar w:top="1440" w:right="1440" w:bottom="1440" w:left="1440" w:header="708" w:footer="708" w:gutter="0"/>
+          <w:pgNumType/>
+          <w:docGrid w:linePitch="360"/>
+        </w:sectPr>
       </w:pPr>
       <w:r>
         <w:rPr>
@@ -5919,9 +5926,1099 @@
         <w:t xml:space="preserve">Nota: las versiones marcadas como "Según Spring Boot" se heredan de su gestión de dependencias; todas las versiones se confirman al crear el proyecto.</w:t>
       </w:r>
     </w:p>
+    <w:p>
+      <w:pPr>
+        <w:pStyle w:val="Heading1"/>
+        <w:spacing w:after="150" w:before="300"/>
+      </w:pPr>
+      <w:r>
+        <w:t xml:space="preserve">Sección 3: Vistas de Arquitectura (Modelo C4 y UML)</w:t>
+      </w:r>
+    </w:p>
+    <w:p>
+      <w:pPr>
+        <w:spacing w:after="160" w:line="276"/>
+        <w:jc w:val="both"/>
+      </w:pPr>
+      <w:r>
+        <w:rPr>
+          <w:rFonts w:ascii="Arial" w:cs="Arial" w:eastAsia="Arial" w:hAnsi="Arial"/>
+          <w:sz w:val="24"/>
+          <w:szCs w:val="24"/>
+        </w:rPr>
+        <w:t xml:space="preserve">Esta sección presenta la arquitectura mediante el Modelo C4 con notación UML estándar. Cada vista incluye su diagrama, una leyenda y un párrafo de lectura. Las fuentes de los diagramas (.puml) y sus exportaciones (.png) están en la carpeta docs/diagramas/ del repositorio.</w:t>
+      </w:r>
+    </w:p>
+    <w:p>
+      <w:pPr>
+        <w:pStyle w:val="Heading2"/>
+        <w:spacing w:after="120" w:before="250"/>
+      </w:pPr>
+      <w:r>
+        <w:t xml:space="preserve">3.1 Vista de Contexto — C4 Nivel 1</w:t>
+      </w:r>
+    </w:p>
+    <w:p>
+      <w:pPr>
+        <w:keepNext/>
+        <w:spacing w:after="160" w:line="276"/>
+        <w:jc w:val="both"/>
+      </w:pPr>
+      <w:r>
+        <w:rPr>
+          <w:rFonts w:ascii="Arial" w:cs="Arial" w:eastAsia="Arial" w:hAnsi="Arial"/>
+          <w:sz w:val="24"/>
+          <w:szCs w:val="24"/>
+        </w:rPr>
+        <w:t xml:space="preserve">Muestra el sistema como una caja negra: quién lo usa y con qué dispositivos y sistemas externos se comunica, sin mostrar ninguna tecnología interna.</w:t>
+      </w:r>
+    </w:p>
+    <w:p>
+      <w:pPr>
+        <w:keepNext/>
+        <w:spacing w:before="120" w:after="80"/>
+        <w:jc w:val="center"/>
+      </w:pPr>
+      <w:r>
+        <w:drawing>
+          <wp:inline distT="0" distB="0" distL="0" distR="0">
+            <wp:extent cx="7680960" cy="2863927"/>
+            <wp:docPr id="101" name="Vista de Contexto C4 Nivel 1" descr="Diagrama UML de la Vista de Contexto: el técnico y el administrador usan el sistema por HTTPS; los sensores envían SMS a un celular receptor que reenvía por HTTPS (webhook) al sistema; el sistema notifica por SMTP al servidor de correo y por HTTPS a Telegram."/>
+            <wp:cNvGraphicFramePr>
+              <a:graphicFrameLocks xmlns:a="http://schemas.openxmlformats.org/drawingml/2006/main" noChangeAspect="1"/>
+            </wp:cNvGraphicFramePr>
+            <a:graphic xmlns:a="http://schemas.openxmlformats.org/drawingml/2006/main">
+              <a:graphicData uri="http://schemas.openxmlformats.org/drawingml/2006/picture">
+                <pic:pic xmlns:pic="http://schemas.openxmlformats.org/drawingml/2006/picture">
+                  <pic:nvPicPr>
+                    <pic:cNvPr id="101" name="Vista de Contexto C4 Nivel 1"/>
+                    <pic:cNvPicPr/>
+                  </pic:nvPicPr>
+                  <pic:blipFill>
+                    <a:blip r:embed="rId9"/>
+                    <a:stretch>
+                      <a:fillRect/>
+                    </a:stretch>
+                  </pic:blipFill>
+                  <pic:spPr>
+                    <a:xfrm>
+                      <a:off x="0" y="0"/>
+                      <a:ext cx="7680960" cy="2863927"/>
+                    </a:xfrm>
+                    <a:prstGeom prst="rect">
+                      <a:avLst/>
+                    </a:prstGeom>
+                  </pic:spPr>
+                </pic:pic>
+              </a:graphicData>
+            </a:graphic>
+          </wp:inline>
+        </w:drawing>
+      </w:r>
+    </w:p>
+    <w:p>
+      <w:pPr>
+        <w:spacing w:after="200" w:line="276"/>
+        <w:jc w:val="center"/>
+      </w:pPr>
+      <w:r>
+        <w:rPr>
+          <w:rFonts w:ascii="Arial" w:cs="Arial" w:eastAsia="Arial" w:hAnsi="Arial"/>
+          <w:i/>
+          <w:iCs/>
+          <w:sz w:val="20"/>
+          <w:szCs w:val="20"/>
+        </w:rPr>
+        <w:t xml:space="preserve">Diagrama UML de la Vista de Contexto (C4 Nivel 1)</w:t>
+      </w:r>
+    </w:p>
+    <w:p>
+      <w:pPr>
+        <w:keepNext/>
+        <w:spacing w:after="100" w:line="276"/>
+        <w:jc w:val="both"/>
+      </w:pPr>
+      <w:r>
+        <w:rPr>
+          <w:rFonts w:ascii="Arial" w:cs="Arial" w:eastAsia="Arial" w:hAnsi="Arial"/>
+          <w:b/>
+          <w:bCs/>
+          <w:sz w:val="24"/>
+          <w:szCs w:val="24"/>
+        </w:rPr>
+        <w:t xml:space="preserve">Leyenda</w:t>
+      </w:r>
+    </w:p>
+    <w:tbl>
+      <w:tblPr>
+        <w:tblW w:type="dxa" w:w="13958"/>
+        <w:tblBorders>
+          <w:top w:val="single" w:color="auto" w:sz="4"/>
+          <w:left w:val="single" w:color="auto" w:sz="4"/>
+          <w:bottom w:val="single" w:color="auto" w:sz="4"/>
+          <w:right w:val="single" w:color="auto" w:sz="4"/>
+          <w:insideH w:val="single" w:color="auto" w:sz="4"/>
+          <w:insideV w:val="single" w:color="auto" w:sz="4"/>
+        </w:tblBorders>
+      </w:tblPr>
+      <w:tblGrid>
+        <w:gridCol w:w="4600"/>
+        <w:gridCol w:w="9358"/>
+      </w:tblGrid>
+      <w:tr>
+        <w:trPr>
+          <w:cantSplit/>
+          <w:tblHeader/>
+        </w:trPr>
+        <w:tc>
+          <w:tcPr>
+            <w:tcW w:type="dxa" w:w="4600"/>
+            <w:shd w:fill="1F4E79" w:val="clear"/>
+            <w:tcMar>
+              <w:top w:type="dxa" w:w="80"/>
+              <w:left w:type="dxa" w:w="100"/>
+              <w:bottom w:type="dxa" w:w="80"/>
+              <w:right w:type="dxa" w:w="100"/>
+            </w:tcMar>
+            <w:vAlign w:val="center"/>
+          </w:tcPr>
+          <w:p>
+            <w:pPr>
+              <w:keepNext/>
+            </w:pPr>
+            <w:r>
+              <w:rPr>
+                <w:rFonts w:ascii="Arial" w:cs="Arial" w:eastAsia="Arial" w:hAnsi="Arial"/>
+                <w:b/>
+                <w:bCs/>
+                <w:color w:val="FFFFFF"/>
+                <w:sz w:val="20"/>
+                <w:szCs w:val="20"/>
+              </w:rPr>
+              <w:t xml:space="preserve">Elemento del diagrama</w:t>
+            </w:r>
+          </w:p>
+        </w:tc>
+        <w:tc>
+          <w:tcPr>
+            <w:tcW w:type="dxa" w:w="9358"/>
+            <w:shd w:fill="1F4E79" w:val="clear"/>
+            <w:tcMar>
+              <w:top w:type="dxa" w:w="80"/>
+              <w:left w:type="dxa" w:w="100"/>
+              <w:bottom w:type="dxa" w:w="80"/>
+              <w:right w:type="dxa" w:w="100"/>
+            </w:tcMar>
+            <w:vAlign w:val="center"/>
+          </w:tcPr>
+          <w:p>
+            <w:pPr>
+              <w:keepNext/>
+            </w:pPr>
+            <w:r>
+              <w:rPr>
+                <w:rFonts w:ascii="Arial" w:cs="Arial" w:eastAsia="Arial" w:hAnsi="Arial"/>
+                <w:b/>
+                <w:bCs/>
+                <w:color w:val="FFFFFF"/>
+                <w:sz w:val="20"/>
+                <w:szCs w:val="20"/>
+              </w:rPr>
+              <w:t xml:space="preserve">Qué representa</w:t>
+            </w:r>
+          </w:p>
+        </w:tc>
+      </w:tr>
+      <w:tr>
+        <w:trPr>
+          <w:cantSplit/>
+        </w:trPr>
+        <w:tc>
+          <w:tcPr>
+            <w:tcW w:type="dxa" w:w="4600"/>
+            <w:tcMar>
+              <w:top w:type="dxa" w:w="80"/>
+              <w:left w:type="dxa" w:w="100"/>
+              <w:bottom w:type="dxa" w:w="80"/>
+              <w:right w:type="dxa" w:w="100"/>
+            </w:tcMar>
+            <w:vAlign w:val="center"/>
+          </w:tcPr>
+          <w:p>
+            <w:pPr>
+              <w:keepNext/>
+            </w:pPr>
+            <w:r>
+              <w:rPr>
+                <w:rFonts w:ascii="Arial" w:cs="Arial" w:eastAsia="Arial" w:hAnsi="Arial"/>
+                <w:b w:val="false"/>
+                <w:bCs w:val="false"/>
+                <w:sz w:val="20"/>
+                <w:szCs w:val="20"/>
+              </w:rPr>
+              <w:t xml:space="preserve">Figura de persona</w:t>
+            </w:r>
+          </w:p>
+        </w:tc>
+        <w:tc>
+          <w:tcPr>
+            <w:tcW w:type="dxa" w:w="9358"/>
+            <w:tcMar>
+              <w:top w:type="dxa" w:w="80"/>
+              <w:left w:type="dxa" w:w="100"/>
+              <w:bottom w:type="dxa" w:w="80"/>
+              <w:right w:type="dxa" w:w="100"/>
+            </w:tcMar>
+            <w:vAlign w:val="center"/>
+          </w:tcPr>
+          <w:p>
+            <w:pPr>
+              <w:keepNext/>
+            </w:pPr>
+            <w:r>
+              <w:rPr>
+                <w:rFonts w:ascii="Arial" w:cs="Arial" w:eastAsia="Arial" w:hAnsi="Arial"/>
+                <w:b w:val="false"/>
+                <w:bCs w:val="false"/>
+                <w:sz w:val="20"/>
+                <w:szCs w:val="20"/>
+              </w:rPr>
+              <w:t xml:space="preserve">Actor humano que usa el sistema.</w:t>
+            </w:r>
+          </w:p>
+        </w:tc>
+      </w:tr>
+      <w:tr>
+        <w:trPr>
+          <w:cantSplit/>
+        </w:trPr>
+        <w:tc>
+          <w:tcPr>
+            <w:tcW w:type="dxa" w:w="4600"/>
+            <w:tcMar>
+              <w:top w:type="dxa" w:w="80"/>
+              <w:left w:type="dxa" w:w="100"/>
+              <w:bottom w:type="dxa" w:w="80"/>
+              <w:right w:type="dxa" w:w="100"/>
+            </w:tcMar>
+            <w:vAlign w:val="center"/>
+          </w:tcPr>
+          <w:p>
+            <w:pPr>
+              <w:keepNext/>
+            </w:pPr>
+            <w:r>
+              <w:rPr>
+                <w:rFonts w:ascii="Arial" w:cs="Arial" w:eastAsia="Arial" w:hAnsi="Arial"/>
+                <w:b w:val="false"/>
+                <w:bCs w:val="false"/>
+                <w:sz w:val="20"/>
+                <w:szCs w:val="20"/>
+              </w:rPr>
+              <w:t xml:space="preserve">Rectángulo «dispositivo externo»</w:t>
+            </w:r>
+          </w:p>
+        </w:tc>
+        <w:tc>
+          <w:tcPr>
+            <w:tcW w:type="dxa" w:w="9358"/>
+            <w:tcMar>
+              <w:top w:type="dxa" w:w="80"/>
+              <w:left w:type="dxa" w:w="100"/>
+              <w:bottom w:type="dxa" w:w="80"/>
+              <w:right w:type="dxa" w:w="100"/>
+            </w:tcMar>
+            <w:vAlign w:val="center"/>
+          </w:tcPr>
+          <w:p>
+            <w:pPr>
+              <w:keepNext/>
+            </w:pPr>
+            <w:r>
+              <w:rPr>
+                <w:rFonts w:ascii="Arial" w:cs="Arial" w:eastAsia="Arial" w:hAnsi="Arial"/>
+                <w:b w:val="false"/>
+                <w:bCs w:val="false"/>
+                <w:sz w:val="20"/>
+                <w:szCs w:val="20"/>
+              </w:rPr>
+              <w:t xml:space="preserve">Equipo físico fuera del sistema que no se modifica (los sensores y el celular receptor de SMS).</w:t>
+            </w:r>
+          </w:p>
+        </w:tc>
+      </w:tr>
+      <w:tr>
+        <w:trPr>
+          <w:cantSplit/>
+        </w:trPr>
+        <w:tc>
+          <w:tcPr>
+            <w:tcW w:type="dxa" w:w="4600"/>
+            <w:tcMar>
+              <w:top w:type="dxa" w:w="80"/>
+              <w:left w:type="dxa" w:w="100"/>
+              <w:bottom w:type="dxa" w:w="80"/>
+              <w:right w:type="dxa" w:w="100"/>
+            </w:tcMar>
+            <w:vAlign w:val="center"/>
+          </w:tcPr>
+          <w:p>
+            <w:pPr>
+              <w:keepNext/>
+            </w:pPr>
+            <w:r>
+              <w:rPr>
+                <w:rFonts w:ascii="Arial" w:cs="Arial" w:eastAsia="Arial" w:hAnsi="Arial"/>
+                <w:b w:val="false"/>
+                <w:bCs w:val="false"/>
+                <w:sz w:val="20"/>
+                <w:szCs w:val="20"/>
+              </w:rPr>
+              <w:t xml:space="preserve">Rectángulo «sistema externo»</w:t>
+            </w:r>
+          </w:p>
+        </w:tc>
+        <w:tc>
+          <w:tcPr>
+            <w:tcW w:type="dxa" w:w="9358"/>
+            <w:tcMar>
+              <w:top w:type="dxa" w:w="80"/>
+              <w:left w:type="dxa" w:w="100"/>
+              <w:bottom w:type="dxa" w:w="80"/>
+              <w:right w:type="dxa" w:w="100"/>
+            </w:tcMar>
+            <w:vAlign w:val="center"/>
+          </w:tcPr>
+          <w:p>
+            <w:pPr>
+              <w:keepNext/>
+            </w:pPr>
+            <w:r>
+              <w:rPr>
+                <w:rFonts w:ascii="Arial" w:cs="Arial" w:eastAsia="Arial" w:hAnsi="Arial"/>
+                <w:b w:val="false"/>
+                <w:bCs w:val="false"/>
+                <w:sz w:val="20"/>
+                <w:szCs w:val="20"/>
+              </w:rPr>
+              <w:t xml:space="preserve">Software de terceros con el que el sistema se comunica (servidor de correo y Telegram).</w:t>
+            </w:r>
+          </w:p>
+        </w:tc>
+      </w:tr>
+      <w:tr>
+        <w:trPr>
+          <w:cantSplit/>
+        </w:trPr>
+        <w:tc>
+          <w:tcPr>
+            <w:tcW w:type="dxa" w:w="4600"/>
+            <w:tcMar>
+              <w:top w:type="dxa" w:w="80"/>
+              <w:left w:type="dxa" w:w="100"/>
+              <w:bottom w:type="dxa" w:w="80"/>
+              <w:right w:type="dxa" w:w="100"/>
+            </w:tcMar>
+            <w:vAlign w:val="center"/>
+          </w:tcPr>
+          <w:p>
+            <w:pPr>
+              <w:keepNext/>
+            </w:pPr>
+            <w:r>
+              <w:rPr>
+                <w:rFonts w:ascii="Arial" w:cs="Arial" w:eastAsia="Arial" w:hAnsi="Arial"/>
+                <w:b w:val="false"/>
+                <w:bCs w:val="false"/>
+                <w:sz w:val="20"/>
+                <w:szCs w:val="20"/>
+              </w:rPr>
+              <w:t xml:space="preserve">Recuadro grande con elipses</w:t>
+            </w:r>
+          </w:p>
+        </w:tc>
+        <w:tc>
+          <w:tcPr>
+            <w:tcW w:type="dxa" w:w="9358"/>
+            <w:tcMar>
+              <w:top w:type="dxa" w:w="80"/>
+              <w:left w:type="dxa" w:w="100"/>
+              <w:bottom w:type="dxa" w:w="80"/>
+              <w:right w:type="dxa" w:w="100"/>
+            </w:tcMar>
+            <w:vAlign w:val="center"/>
+          </w:tcPr>
+          <w:p>
+            <w:pPr>
+              <w:keepNext/>
+            </w:pPr>
+            <w:r>
+              <w:rPr>
+                <w:rFonts w:ascii="Arial" w:cs="Arial" w:eastAsia="Arial" w:hAnsi="Arial"/>
+                <w:b w:val="false"/>
+                <w:bCs w:val="false"/>
+                <w:sz w:val="20"/>
+                <w:szCs w:val="20"/>
+              </w:rPr>
+              <w:t xml:space="preserve">Límite del sistema y sus capacidades principales.</w:t>
+            </w:r>
+          </w:p>
+        </w:tc>
+      </w:tr>
+      <w:tr>
+        <w:trPr>
+          <w:cantSplit/>
+        </w:trPr>
+        <w:tc>
+          <w:tcPr>
+            <w:tcW w:type="dxa" w:w="4600"/>
+            <w:tcMar>
+              <w:top w:type="dxa" w:w="80"/>
+              <w:left w:type="dxa" w:w="100"/>
+              <w:bottom w:type="dxa" w:w="80"/>
+              <w:right w:type="dxa" w:w="100"/>
+            </w:tcMar>
+            <w:vAlign w:val="center"/>
+          </w:tcPr>
+          <w:p>
+            <w:r>
+              <w:rPr>
+                <w:rFonts w:ascii="Arial" w:cs="Arial" w:eastAsia="Arial" w:hAnsi="Arial"/>
+                <w:b w:val="false"/>
+                <w:bCs w:val="false"/>
+                <w:sz w:val="20"/>
+                <w:szCs w:val="20"/>
+              </w:rPr>
+              <w:t xml:space="preserve">Flecha con etiqueta</w:t>
+            </w:r>
+          </w:p>
+        </w:tc>
+        <w:tc>
+          <w:tcPr>
+            <w:tcW w:type="dxa" w:w="9358"/>
+            <w:tcMar>
+              <w:top w:type="dxa" w:w="80"/>
+              <w:left w:type="dxa" w:w="100"/>
+              <w:bottom w:type="dxa" w:w="80"/>
+              <w:right w:type="dxa" w:w="100"/>
+            </w:tcMar>
+            <w:vAlign w:val="center"/>
+          </w:tcPr>
+          <w:p>
+            <w:r>
+              <w:rPr>
+                <w:rFonts w:ascii="Arial" w:cs="Arial" w:eastAsia="Arial" w:hAnsi="Arial"/>
+                <w:b w:val="false"/>
+                <w:bCs w:val="false"/>
+                <w:sz w:val="20"/>
+                <w:szCs w:val="20"/>
+              </w:rPr>
+              <w:t xml:space="preserve">Apunta hacia quien recibe la comunicación; la etiqueta indica el protocolo.</w:t>
+            </w:r>
+          </w:p>
+        </w:tc>
+      </w:tr>
+    </w:tbl>
+    <w:p>
+      <w:pPr>
+        <w:spacing w:after="120"/>
+      </w:pPr>
+    </w:p>
+    <w:p>
+      <w:pPr>
+        <w:spacing w:after="160" w:line="276"/>
+        <w:jc w:val="both"/>
+      </w:pPr>
+      <w:r>
+        <w:rPr>
+          <w:rFonts w:ascii="Arial" w:cs="Arial" w:eastAsia="Arial" w:hAnsi="Arial"/>
+          <w:b/>
+          <w:bCs/>
+          <w:sz w:val="24"/>
+          <w:szCs w:val="24"/>
+        </w:rPr>
+        <w:t xml:space="preserve">Actores y relación con las historias de usuario (sección 1.2): </w:t>
+      </w:r>
+      <w:r>
+        <w:rPr>
+          <w:rFonts w:ascii="Arial" w:cs="Arial" w:eastAsia="Arial" w:hAnsi="Arial"/>
+          <w:sz w:val="24"/>
+          <w:szCs w:val="24"/>
+        </w:rPr>
+        <w:t xml:space="preserve">el administrador (HU-02) y el técnico (HU-03) son los actores humanos y usan el sistema por HTTPS. La HU-01 la ejecuta el propio sistema al recibir y evaluar las lecturas, por eso no aparece como un actor externo. Cada interfaz externa figura con su protocolo: SMS desde los sensores, HTTPS (webhook) desde el celular receptor, SMTP hacia el servidor de correo y HTTPS (Bot API) hacia Telegram.</w:t>
+      </w:r>
+    </w:p>
+    <w:p>
+      <w:pPr>
+        <w:spacing w:after="160" w:line="276"/>
+        <w:jc w:val="both"/>
+      </w:pPr>
+      <w:r>
+        <w:rPr>
+          <w:rFonts w:ascii="Arial" w:cs="Arial" w:eastAsia="Arial" w:hAnsi="Arial"/>
+          <w:b/>
+          <w:bCs/>
+          <w:sz w:val="24"/>
+          <w:szCs w:val="24"/>
+        </w:rPr>
+        <w:t xml:space="preserve">Lectura en 30 segundos: </w:t>
+      </w:r>
+      <w:r>
+        <w:rPr>
+          <w:rFonts w:ascii="Arial" w:cs="Arial" w:eastAsia="Arial" w:hAnsi="Arial"/>
+          <w:sz w:val="24"/>
+          <w:szCs w:val="24"/>
+        </w:rPr>
+        <w:t xml:space="preserve">ocho sensores de humedad envían sus lecturas por SMS a un celular que ya existe en el caso. Ese celular las reenvía por HTTPS (webhook) al sistema, que las evalúa, genera alertas y las notifica por correo (SMTP) y por Telegram (HTTPS). El técnico consulta las alertas y el estado de los sensores, y el administrador configura los umbrales de riesgo, ambos por HTTPS. Los sensores y el celular no se modifican: todo el valor sale del software.</w:t>
+      </w:r>
+    </w:p>
+    <w:p>
+      <w:pPr>
+        <w:spacing w:after="160" w:line="276"/>
+        <w:jc w:val="both"/>
+      </w:pPr>
+      <w:r>
+        <w:rPr>
+          <w:rFonts w:ascii="Arial" w:cs="Arial" w:eastAsia="Arial" w:hAnsi="Arial"/>
+          <w:i/>
+          <w:iCs/>
+          <w:sz w:val="24"/>
+          <w:szCs w:val="24"/>
+        </w:rPr>
+        <w:t xml:space="preserve">Nota: el reenvío del SMS desde el celular receptor hacia el webhook es un supuesto de diseño por confirmar con el cliente. El caso establece que los sensores envían sus lecturas por SMS a un celular y que su hardware no puede modificarse (RT-01), pero no indica cómo llega ese mensaje a un sistema de software. El mecanismo de reenvío aún no está definido y deberá ser compatible con la restricción de presupuesto (RA-02), es decir, sin un gateway SMS de pago; mientras tanto, en desarrollo el SMS se simula con Postman (sección 2.2).</w:t>
+      </w:r>
+    </w:p>
+    <w:p>
+      <w:r>
+        <w:br w:type="page"/>
+      </w:r>
+    </w:p>
+    <w:p>
+      <w:pPr>
+        <w:pStyle w:val="Heading2"/>
+        <w:spacing w:after="120" w:before="250"/>
+      </w:pPr>
+      <w:r>
+        <w:t xml:space="preserve">3.2 Vista de Contenedores — C4 Nivel 2</w:t>
+      </w:r>
+    </w:p>
+    <w:p>
+      <w:pPr>
+        <w:keepNext/>
+        <w:spacing w:after="160" w:line="276"/>
+        <w:jc w:val="both"/>
+      </w:pPr>
+      <w:r>
+        <w:rPr>
+          <w:rFonts w:ascii="Arial" w:cs="Arial" w:eastAsia="Arial" w:hAnsi="Arial"/>
+          <w:sz w:val="24"/>
+          <w:szCs w:val="24"/>
+        </w:rPr>
+        <w:t xml:space="preserve">Abre la caja negra del sistema: muestra las piezas que se ejecutan por separado y los almacenes de datos, cada una con su tecnología entre corchetes.</w:t>
+      </w:r>
+    </w:p>
+    <w:p>
+      <w:pPr>
+        <w:keepNext/>
+        <w:spacing w:before="120" w:after="80"/>
+        <w:jc w:val="center"/>
+      </w:pPr>
+      <w:r>
+        <w:drawing>
+          <wp:inline distT="0" distB="0" distL="0" distR="0">
+            <wp:extent cx="7680960" cy="3081473"/>
+            <wp:docPr id="102" name="Vista de Contenedores C4 Nivel 2" descr="Diagrama UML de componentes de la Vista de Contenedores: aplicación web React, API Backend Java con Spring Boot y base de datos PostgreSQL dentro del sistema; sensores, celular receptor, servidor de correo y Telegram fuera del sistema, cada flecha con su protocolo."/>
+            <wp:cNvGraphicFramePr>
+              <a:graphicFrameLocks xmlns:a="http://schemas.openxmlformats.org/drawingml/2006/main" noChangeAspect="1"/>
+            </wp:cNvGraphicFramePr>
+            <a:graphic xmlns:a="http://schemas.openxmlformats.org/drawingml/2006/main">
+              <a:graphicData uri="http://schemas.openxmlformats.org/drawingml/2006/picture">
+                <pic:pic xmlns:pic="http://schemas.openxmlformats.org/drawingml/2006/picture">
+                  <pic:nvPicPr>
+                    <pic:cNvPr id="102" name="Vista de Contenedores C4 Nivel 2"/>
+                    <pic:cNvPicPr/>
+                  </pic:nvPicPr>
+                  <pic:blipFill>
+                    <a:blip r:embed="rId10"/>
+                    <a:stretch>
+                      <a:fillRect/>
+                    </a:stretch>
+                  </pic:blipFill>
+                  <pic:spPr>
+                    <a:xfrm>
+                      <a:off x="0" y="0"/>
+                      <a:ext cx="7680960" cy="3081473"/>
+                    </a:xfrm>
+                    <a:prstGeom prst="rect">
+                      <a:avLst/>
+                    </a:prstGeom>
+                  </pic:spPr>
+                </pic:pic>
+              </a:graphicData>
+            </a:graphic>
+          </wp:inline>
+        </w:drawing>
+      </w:r>
+    </w:p>
+    <w:p>
+      <w:pPr>
+        <w:spacing w:after="200" w:line="276"/>
+        <w:jc w:val="center"/>
+      </w:pPr>
+      <w:r>
+        <w:rPr>
+          <w:rFonts w:ascii="Arial" w:cs="Arial" w:eastAsia="Arial" w:hAnsi="Arial"/>
+          <w:i/>
+          <w:iCs/>
+          <w:sz w:val="20"/>
+          <w:szCs w:val="20"/>
+        </w:rPr>
+        <w:t xml:space="preserve">Diagrama UML de componentes de la Vista de Contenedores (C4 Nivel 2)</w:t>
+      </w:r>
+    </w:p>
+    <w:p>
+      <w:pPr>
+        <w:keepNext/>
+        <w:spacing w:after="100" w:line="276"/>
+        <w:jc w:val="both"/>
+      </w:pPr>
+      <w:r>
+        <w:rPr>
+          <w:rFonts w:ascii="Arial" w:cs="Arial" w:eastAsia="Arial" w:hAnsi="Arial"/>
+          <w:b/>
+          <w:bCs/>
+          <w:sz w:val="24"/>
+          <w:szCs w:val="24"/>
+        </w:rPr>
+        <w:t xml:space="preserve">Leyenda</w:t>
+      </w:r>
+    </w:p>
+    <w:tbl>
+      <w:tblPr>
+        <w:tblW w:type="dxa" w:w="13958"/>
+        <w:tblBorders>
+          <w:top w:val="single" w:color="auto" w:sz="4"/>
+          <w:left w:val="single" w:color="auto" w:sz="4"/>
+          <w:bottom w:val="single" w:color="auto" w:sz="4"/>
+          <w:right w:val="single" w:color="auto" w:sz="4"/>
+          <w:insideH w:val="single" w:color="auto" w:sz="4"/>
+          <w:insideV w:val="single" w:color="auto" w:sz="4"/>
+        </w:tblBorders>
+      </w:tblPr>
+      <w:tblGrid>
+        <w:gridCol w:w="4600"/>
+        <w:gridCol w:w="9358"/>
+      </w:tblGrid>
+      <w:tr>
+        <w:trPr>
+          <w:cantSplit/>
+          <w:tblHeader/>
+        </w:trPr>
+        <w:tc>
+          <w:tcPr>
+            <w:tcW w:type="dxa" w:w="4600"/>
+            <w:shd w:fill="1F4E79" w:val="clear"/>
+            <w:tcMar>
+              <w:top w:type="dxa" w:w="80"/>
+              <w:left w:type="dxa" w:w="100"/>
+              <w:bottom w:type="dxa" w:w="80"/>
+              <w:right w:type="dxa" w:w="100"/>
+            </w:tcMar>
+            <w:vAlign w:val="center"/>
+          </w:tcPr>
+          <w:p>
+            <w:pPr>
+              <w:keepNext/>
+            </w:pPr>
+            <w:r>
+              <w:rPr>
+                <w:rFonts w:ascii="Arial" w:cs="Arial" w:eastAsia="Arial" w:hAnsi="Arial"/>
+                <w:b/>
+                <w:bCs/>
+                <w:color w:val="FFFFFF"/>
+                <w:sz w:val="20"/>
+                <w:szCs w:val="20"/>
+              </w:rPr>
+              <w:t xml:space="preserve">Elemento del diagrama</w:t>
+            </w:r>
+          </w:p>
+        </w:tc>
+        <w:tc>
+          <w:tcPr>
+            <w:tcW w:type="dxa" w:w="9358"/>
+            <w:shd w:fill="1F4E79" w:val="clear"/>
+            <w:tcMar>
+              <w:top w:type="dxa" w:w="80"/>
+              <w:left w:type="dxa" w:w="100"/>
+              <w:bottom w:type="dxa" w:w="80"/>
+              <w:right w:type="dxa" w:w="100"/>
+            </w:tcMar>
+            <w:vAlign w:val="center"/>
+          </w:tcPr>
+          <w:p>
+            <w:pPr>
+              <w:keepNext/>
+            </w:pPr>
+            <w:r>
+              <w:rPr>
+                <w:rFonts w:ascii="Arial" w:cs="Arial" w:eastAsia="Arial" w:hAnsi="Arial"/>
+                <w:b/>
+                <w:bCs/>
+                <w:color w:val="FFFFFF"/>
+                <w:sz w:val="20"/>
+                <w:szCs w:val="20"/>
+              </w:rPr>
+              <w:t xml:space="preserve">Qué representa</w:t>
+            </w:r>
+          </w:p>
+        </w:tc>
+      </w:tr>
+      <w:tr>
+        <w:trPr>
+          <w:cantSplit/>
+        </w:trPr>
+        <w:tc>
+          <w:tcPr>
+            <w:tcW w:type="dxa" w:w="4600"/>
+            <w:tcMar>
+              <w:top w:type="dxa" w:w="80"/>
+              <w:left w:type="dxa" w:w="100"/>
+              <w:bottom w:type="dxa" w:w="80"/>
+              <w:right w:type="dxa" w:w="100"/>
+            </w:tcMar>
+            <w:vAlign w:val="center"/>
+          </w:tcPr>
+          <w:p>
+            <w:pPr>
+              <w:keepNext/>
+            </w:pPr>
+            <w:r>
+              <w:rPr>
+                <w:rFonts w:ascii="Arial" w:cs="Arial" w:eastAsia="Arial" w:hAnsi="Arial"/>
+                <w:b w:val="false"/>
+                <w:bCs w:val="false"/>
+                <w:sz w:val="20"/>
+                <w:szCs w:val="20"/>
+              </w:rPr>
+              <w:t xml:space="preserve">Componente «contenedor» con la tecnología entre corchetes</w:t>
+            </w:r>
+          </w:p>
+        </w:tc>
+        <w:tc>
+          <w:tcPr>
+            <w:tcW w:type="dxa" w:w="9358"/>
+            <w:tcMar>
+              <w:top w:type="dxa" w:w="80"/>
+              <w:left w:type="dxa" w:w="100"/>
+              <w:bottom w:type="dxa" w:w="80"/>
+              <w:right w:type="dxa" w:w="100"/>
+            </w:tcMar>
+            <w:vAlign w:val="center"/>
+          </w:tcPr>
+          <w:p>
+            <w:pPr>
+              <w:keepNext/>
+            </w:pPr>
+            <w:r>
+              <w:rPr>
+                <w:rFonts w:ascii="Arial" w:cs="Arial" w:eastAsia="Arial" w:hAnsi="Arial"/>
+                <w:b w:val="false"/>
+                <w:bCs w:val="false"/>
+                <w:sz w:val="20"/>
+                <w:szCs w:val="20"/>
+              </w:rPr>
+              <w:t xml:space="preserve">Pieza propia que se ejecuta por separado: la aplicación web y la API.</w:t>
+            </w:r>
+          </w:p>
+        </w:tc>
+      </w:tr>
+      <w:tr>
+        <w:trPr>
+          <w:cantSplit/>
+        </w:trPr>
+        <w:tc>
+          <w:tcPr>
+            <w:tcW w:type="dxa" w:w="4600"/>
+            <w:tcMar>
+              <w:top w:type="dxa" w:w="80"/>
+              <w:left w:type="dxa" w:w="100"/>
+              <w:bottom w:type="dxa" w:w="80"/>
+              <w:right w:type="dxa" w:w="100"/>
+            </w:tcMar>
+            <w:vAlign w:val="center"/>
+          </w:tcPr>
+          <w:p>
+            <w:pPr>
+              <w:keepNext/>
+            </w:pPr>
+            <w:r>
+              <w:rPr>
+                <w:rFonts w:ascii="Arial" w:cs="Arial" w:eastAsia="Arial" w:hAnsi="Arial"/>
+                <w:b w:val="false"/>
+                <w:bCs w:val="false"/>
+                <w:sz w:val="20"/>
+                <w:szCs w:val="20"/>
+              </w:rPr>
+              <w:t xml:space="preserve">Cilindro «contenedor»</w:t>
+            </w:r>
+          </w:p>
+        </w:tc>
+        <w:tc>
+          <w:tcPr>
+            <w:tcW w:type="dxa" w:w="9358"/>
+            <w:tcMar>
+              <w:top w:type="dxa" w:w="80"/>
+              <w:left w:type="dxa" w:w="100"/>
+              <w:bottom w:type="dxa" w:w="80"/>
+              <w:right w:type="dxa" w:w="100"/>
+            </w:tcMar>
+            <w:vAlign w:val="center"/>
+          </w:tcPr>
+          <w:p>
+            <w:pPr>
+              <w:keepNext/>
+            </w:pPr>
+            <w:r>
+              <w:rPr>
+                <w:rFonts w:ascii="Arial" w:cs="Arial" w:eastAsia="Arial" w:hAnsi="Arial"/>
+                <w:b w:val="false"/>
+                <w:bCs w:val="false"/>
+                <w:sz w:val="20"/>
+                <w:szCs w:val="20"/>
+              </w:rPr>
+              <w:t xml:space="preserve">Almacén de datos propio: la base de datos.</w:t>
+            </w:r>
+          </w:p>
+        </w:tc>
+      </w:tr>
+      <w:tr>
+        <w:trPr>
+          <w:cantSplit/>
+        </w:trPr>
+        <w:tc>
+          <w:tcPr>
+            <w:tcW w:type="dxa" w:w="4600"/>
+            <w:tcMar>
+              <w:top w:type="dxa" w:w="80"/>
+              <w:left w:type="dxa" w:w="100"/>
+              <w:bottom w:type="dxa" w:w="80"/>
+              <w:right w:type="dxa" w:w="100"/>
+            </w:tcMar>
+            <w:vAlign w:val="center"/>
+          </w:tcPr>
+          <w:p>
+            <w:pPr>
+              <w:keepNext/>
+            </w:pPr>
+            <w:r>
+              <w:rPr>
+                <w:rFonts w:ascii="Arial" w:cs="Arial" w:eastAsia="Arial" w:hAnsi="Arial"/>
+                <w:b w:val="false"/>
+                <w:bCs w:val="false"/>
+                <w:sz w:val="20"/>
+                <w:szCs w:val="20"/>
+              </w:rPr>
+              <w:t xml:space="preserve">Recuadro grande</w:t>
+            </w:r>
+          </w:p>
+        </w:tc>
+        <w:tc>
+          <w:tcPr>
+            <w:tcW w:type="dxa" w:w="9358"/>
+            <w:tcMar>
+              <w:top w:type="dxa" w:w="80"/>
+              <w:left w:type="dxa" w:w="100"/>
+              <w:bottom w:type="dxa" w:w="80"/>
+              <w:right w:type="dxa" w:w="100"/>
+            </w:tcMar>
+            <w:vAlign w:val="center"/>
+          </w:tcPr>
+          <w:p>
+            <w:pPr>
+              <w:keepNext/>
+            </w:pPr>
+            <w:r>
+              <w:rPr>
+                <w:rFonts w:ascii="Arial" w:cs="Arial" w:eastAsia="Arial" w:hAnsi="Arial"/>
+                <w:b w:val="false"/>
+                <w:bCs w:val="false"/>
+                <w:sz w:val="20"/>
+                <w:szCs w:val="20"/>
+              </w:rPr>
+              <w:t xml:space="preserve">Límite del sistema: lo de adentro es propio, lo de afuera no se controla.</w:t>
+            </w:r>
+          </w:p>
+        </w:tc>
+      </w:tr>
+      <w:tr>
+        <w:trPr>
+          <w:cantSplit/>
+        </w:trPr>
+        <w:tc>
+          <w:tcPr>
+            <w:tcW w:type="dxa" w:w="4600"/>
+            <w:tcMar>
+              <w:top w:type="dxa" w:w="80"/>
+              <w:left w:type="dxa" w:w="100"/>
+              <w:bottom w:type="dxa" w:w="80"/>
+              <w:right w:type="dxa" w:w="100"/>
+            </w:tcMar>
+            <w:vAlign w:val="center"/>
+          </w:tcPr>
+          <w:p>
+            <w:pPr>
+              <w:keepNext/>
+            </w:pPr>
+            <w:r>
+              <w:rPr>
+                <w:rFonts w:ascii="Arial" w:cs="Arial" w:eastAsia="Arial" w:hAnsi="Arial"/>
+                <w:b w:val="false"/>
+                <w:bCs w:val="false"/>
+                <w:sz w:val="20"/>
+                <w:szCs w:val="20"/>
+              </w:rPr>
+              <w:t xml:space="preserve">Rectángulos «dispositivo externo» y «sistema externo»</w:t>
+            </w:r>
+          </w:p>
+        </w:tc>
+        <w:tc>
+          <w:tcPr>
+            <w:tcW w:type="dxa" w:w="9358"/>
+            <w:tcMar>
+              <w:top w:type="dxa" w:w="80"/>
+              <w:left w:type="dxa" w:w="100"/>
+              <w:bottom w:type="dxa" w:w="80"/>
+              <w:right w:type="dxa" w:w="100"/>
+            </w:tcMar>
+            <w:vAlign w:val="center"/>
+          </w:tcPr>
+          <w:p>
+            <w:pPr>
+              <w:keepNext/>
+            </w:pPr>
+            <w:r>
+              <w:rPr>
+                <w:rFonts w:ascii="Arial" w:cs="Arial" w:eastAsia="Arial" w:hAnsi="Arial"/>
+                <w:b w:val="false"/>
+                <w:bCs w:val="false"/>
+                <w:sz w:val="20"/>
+                <w:szCs w:val="20"/>
+              </w:rPr>
+              <w:t xml:space="preserve">Los mismos elementos externos de la Vista de Contexto.</w:t>
+            </w:r>
+          </w:p>
+        </w:tc>
+      </w:tr>
+      <w:tr>
+        <w:trPr>
+          <w:cantSplit/>
+        </w:trPr>
+        <w:tc>
+          <w:tcPr>
+            <w:tcW w:type="dxa" w:w="4600"/>
+            <w:tcMar>
+              <w:top w:type="dxa" w:w="80"/>
+              <w:left w:type="dxa" w:w="100"/>
+              <w:bottom w:type="dxa" w:w="80"/>
+              <w:right w:type="dxa" w:w="100"/>
+            </w:tcMar>
+            <w:vAlign w:val="center"/>
+          </w:tcPr>
+          <w:p>
+            <w:r>
+              <w:rPr>
+                <w:rFonts w:ascii="Arial" w:cs="Arial" w:eastAsia="Arial" w:hAnsi="Arial"/>
+                <w:b w:val="false"/>
+                <w:bCs w:val="false"/>
+                <w:sz w:val="20"/>
+                <w:szCs w:val="20"/>
+              </w:rPr>
+              <w:t xml:space="preserve">Flecha con etiqueta</w:t>
+            </w:r>
+          </w:p>
+        </w:tc>
+        <w:tc>
+          <w:tcPr>
+            <w:tcW w:type="dxa" w:w="9358"/>
+            <w:tcMar>
+              <w:top w:type="dxa" w:w="80"/>
+              <w:left w:type="dxa" w:w="100"/>
+              <w:bottom w:type="dxa" w:w="80"/>
+              <w:right w:type="dxa" w:w="100"/>
+            </w:tcMar>
+            <w:vAlign w:val="center"/>
+          </w:tcPr>
+          <w:p>
+            <w:r>
+              <w:rPr>
+                <w:rFonts w:ascii="Arial" w:cs="Arial" w:eastAsia="Arial" w:hAnsi="Arial"/>
+                <w:b w:val="false"/>
+                <w:bCs w:val="false"/>
+                <w:sz w:val="20"/>
+                <w:szCs w:val="20"/>
+              </w:rPr>
+              <w:t xml:space="preserve">Apunta hacia quien recibe la comunicación; la etiqueta indica el protocolo (y el puerto cuando aplica).</w:t>
+            </w:r>
+          </w:p>
+        </w:tc>
+      </w:tr>
+    </w:tbl>
+    <w:p>
+      <w:pPr>
+        <w:spacing w:after="120"/>
+      </w:pPr>
+    </w:p>
+    <w:p>
+      <w:pPr>
+        <w:spacing w:after="160" w:line="276"/>
+        <w:jc w:val="both"/>
+      </w:pPr>
+      <w:r>
+        <w:rPr>
+          <w:rFonts w:ascii="Arial" w:cs="Arial" w:eastAsia="Arial" w:hAnsi="Arial"/>
+          <w:b/>
+          <w:bCs/>
+          <w:sz w:val="24"/>
+          <w:szCs w:val="24"/>
+        </w:rPr>
+        <w:t xml:space="preserve">Correspondencia con la pila tecnológica (sección 2.2): </w:t>
+      </w:r>
+      <w:r>
+        <w:rPr>
+          <w:rFonts w:ascii="Arial" w:cs="Arial" w:eastAsia="Arial" w:hAnsi="Arial"/>
+          <w:sz w:val="24"/>
+          <w:szCs w:val="24"/>
+        </w:rPr>
+        <w:t xml:space="preserve">la aplicación web es React 19 con Vite; la API es Java 21 con Spring Boot 4.1.x, que incluye Spring Security con JWT, Spring Data JPA y Flyway; y la base de datos es PostgreSQL 18. El webhook es la entrada de los SMS, y el correo (SMTP) y Telegram son los canales de salida. Las tres capas del patrón N-Capas (sección 2.1) están dentro del contenedor API Backend.</w:t>
+      </w:r>
+    </w:p>
+    <w:p>
+      <w:pPr>
+        <w:spacing w:after="160" w:line="276"/>
+        <w:jc w:val="both"/>
+      </w:pPr>
+      <w:r>
+        <w:rPr>
+          <w:rFonts w:ascii="Arial" w:cs="Arial" w:eastAsia="Arial" w:hAnsi="Arial"/>
+          <w:b/>
+          <w:bCs/>
+          <w:sz w:val="24"/>
+          <w:szCs w:val="24"/>
+        </w:rPr>
+        <w:t xml:space="preserve">Lectura en 30 segundos: </w:t>
+      </w:r>
+      <w:r>
+        <w:rPr>
+          <w:rFonts w:ascii="Arial" w:cs="Arial" w:eastAsia="Arial" w:hAnsi="Arial"/>
+          <w:sz w:val="24"/>
+          <w:szCs w:val="24"/>
+        </w:rPr>
+        <w:t xml:space="preserve">el técnico y el administrador entran por HTTPS a la aplicación web (React), que habla con la API (Spring Boot) en JSON por HTTPS con JWT. La API es la única pieza que accede a la base de datos PostgreSQL (JDBC, puerto 5432). Además recibe por webhook HTTPS los SMS que reenvía el celular receptor y envía las alertas por correo (SMTP) y por Telegram (HTTPS). Las tres piezas dentro del recuadro son propias; los dispositivos y sistemas de afuera no se controlan.</w:t>
+      </w:r>
+    </w:p>
     <w:sectPr>
       <w:footerReference w:type="default" r:id="rId7"/>
-      <w:pgSz w:w="11906" w:h="16838" w:orient="portrait"/>
+      <w:pgSz w:w="16838" w:h="11906" w:orient="landscape"/>
       <w:pgMar w:top="1440" w:right="1440" w:bottom="1440" w:left="1440" w:header="708" w:footer="708" w:gutter="0"/>
       <w:pgNumType/>
       <w:docGrid w:linePitch="360"/>

</xml_diff>